<commit_message>
Tweaks About Section 6
</commit_message>
<xml_diff>
--- a/Full_Home_Network_Project.docx
+++ b/Full_Home_Network_Project.docx
@@ -314,7 +314,6 @@
               </w:rPr>
             </w:pPr>
             <w:proofErr w:type="spellStart"/>
-            <w:proofErr w:type="gramStart"/>
             <w:r>
               <w:rPr>
                 <w:rFonts w:asciiTheme="minorBidi" w:eastAsia="Arial" w:hAnsiTheme="minorBidi"/>
@@ -322,7 +321,6 @@
               <w:t>Dr.Gusatvo</w:t>
             </w:r>
             <w:proofErr w:type="spellEnd"/>
-            <w:proofErr w:type="gramEnd"/>
             <w:r>
               <w:rPr>
                 <w:rFonts w:asciiTheme="minorBidi" w:eastAsia="Arial" w:hAnsiTheme="minorBidi"/>
@@ -1080,7 +1078,6 @@
               </w:rPr>
             </w:pPr>
             <w:proofErr w:type="spellStart"/>
-            <w:proofErr w:type="gramStart"/>
             <w:r>
               <w:rPr>
                 <w:rFonts w:asciiTheme="minorBidi" w:eastAsia="Arial" w:hAnsiTheme="minorBidi"/>
@@ -1088,7 +1085,6 @@
               <w:t>S.Adam</w:t>
             </w:r>
             <w:proofErr w:type="spellEnd"/>
-            <w:proofErr w:type="gramEnd"/>
             <w:r>
               <w:rPr>
                 <w:rFonts w:asciiTheme="minorBidi" w:eastAsia="Arial" w:hAnsiTheme="minorBidi"/>
@@ -1255,7 +1251,7 @@
             </w:rPr>
             <w:fldChar w:fldCharType="separate"/>
           </w:r>
-          <w:hyperlink w:anchor="_Toc226065911" w:history="1">
+          <w:hyperlink w:anchor="_Toc226327475" w:history="1">
             <w:r>
               <w:rPr>
                 <w:rStyle w:val="Hyperlink"/>
@@ -1283,7 +1279,7 @@
                 <w:noProof/>
                 <w:webHidden/>
               </w:rPr>
-              <w:instrText xml:space="preserve"> PAGEREF _Toc226065911 \h </w:instrText>
+              <w:instrText xml:space="preserve"> PAGEREF _Toc226327475 \h </w:instrText>
             </w:r>
             <w:r>
               <w:rPr>
@@ -1328,7 +1324,7 @@
               <w14:ligatures w14:val="standardContextual"/>
             </w:rPr>
           </w:pPr>
-          <w:hyperlink w:anchor="_Toc226065912" w:history="1">
+          <w:hyperlink w:anchor="_Toc226327476" w:history="1">
             <w:r>
               <w:rPr>
                 <w:rStyle w:val="Hyperlink"/>
@@ -1366,7 +1362,7 @@
                 <w:noProof/>
                 <w:webHidden/>
               </w:rPr>
-              <w:instrText xml:space="preserve"> PAGEREF _Toc226065912 \h </w:instrText>
+              <w:instrText xml:space="preserve"> PAGEREF _Toc226327476 \h </w:instrText>
             </w:r>
             <w:r>
               <w:rPr>
@@ -1411,7 +1407,7 @@
               <w14:ligatures w14:val="standardContextual"/>
             </w:rPr>
           </w:pPr>
-          <w:hyperlink w:anchor="_Toc226065913" w:history="1">
+          <w:hyperlink w:anchor="_Toc226327477" w:history="1">
             <w:r>
               <w:rPr>
                 <w:rStyle w:val="Hyperlink"/>
@@ -1449,7 +1445,7 @@
                 <w:noProof/>
                 <w:webHidden/>
               </w:rPr>
-              <w:instrText xml:space="preserve"> PAGEREF _Toc226065913 \h </w:instrText>
+              <w:instrText xml:space="preserve"> PAGEREF _Toc226327477 \h </w:instrText>
             </w:r>
             <w:r>
               <w:rPr>
@@ -1494,7 +1490,7 @@
               <w14:ligatures w14:val="standardContextual"/>
             </w:rPr>
           </w:pPr>
-          <w:hyperlink w:anchor="_Toc226065914" w:history="1">
+          <w:hyperlink w:anchor="_Toc226327478" w:history="1">
             <w:r>
               <w:rPr>
                 <w:rStyle w:val="Hyperlink"/>
@@ -1532,7 +1528,7 @@
                 <w:noProof/>
                 <w:webHidden/>
               </w:rPr>
-              <w:instrText xml:space="preserve"> PAGEREF _Toc226065914 \h </w:instrText>
+              <w:instrText xml:space="preserve"> PAGEREF _Toc226327478 \h </w:instrText>
             </w:r>
             <w:r>
               <w:rPr>
@@ -1577,7 +1573,7 @@
               <w14:ligatures w14:val="standardContextual"/>
             </w:rPr>
           </w:pPr>
-          <w:hyperlink w:anchor="_Toc226065915" w:history="1">
+          <w:hyperlink w:anchor="_Toc226327479" w:history="1">
             <w:r>
               <w:rPr>
                 <w:rStyle w:val="Hyperlink"/>
@@ -1605,7 +1601,7 @@
                 <w:noProof/>
                 <w:webHidden/>
               </w:rPr>
-              <w:instrText xml:space="preserve"> PAGEREF _Toc226065915 \h </w:instrText>
+              <w:instrText xml:space="preserve"> PAGEREF _Toc226327479 \h </w:instrText>
             </w:r>
             <w:r>
               <w:rPr>
@@ -1650,7 +1646,7 @@
               <w14:ligatures w14:val="standardContextual"/>
             </w:rPr>
           </w:pPr>
-          <w:hyperlink w:anchor="_Toc226065916" w:history="1">
+          <w:hyperlink w:anchor="_Toc226327480" w:history="1">
             <w:r>
               <w:rPr>
                 <w:rStyle w:val="Hyperlink"/>
@@ -1695,7 +1691,7 @@
                 <w:noProof/>
                 <w:webHidden/>
               </w:rPr>
-              <w:instrText xml:space="preserve"> PAGEREF _Toc226065916 \h </w:instrText>
+              <w:instrText xml:space="preserve"> PAGEREF _Toc226327480 \h </w:instrText>
             </w:r>
             <w:r>
               <w:rPr>
@@ -1740,7 +1736,7 @@
               <w14:ligatures w14:val="standardContextual"/>
             </w:rPr>
           </w:pPr>
-          <w:hyperlink w:anchor="_Toc226065917" w:history="1">
+          <w:hyperlink w:anchor="_Toc226327481" w:history="1">
             <w:r>
               <w:rPr>
                 <w:rStyle w:val="Hyperlink"/>
@@ -1778,7 +1774,7 @@
                 <w:noProof/>
                 <w:webHidden/>
               </w:rPr>
-              <w:instrText xml:space="preserve"> PAGEREF _Toc226065917 \h </w:instrText>
+              <w:instrText xml:space="preserve"> PAGEREF _Toc226327481 \h </w:instrText>
             </w:r>
             <w:r>
               <w:rPr>
@@ -1823,7 +1819,7 @@
               <w14:ligatures w14:val="standardContextual"/>
             </w:rPr>
           </w:pPr>
-          <w:hyperlink w:anchor="_Toc226065918" w:history="1">
+          <w:hyperlink w:anchor="_Toc226327482" w:history="1">
             <w:r>
               <w:rPr>
                 <w:rStyle w:val="Hyperlink"/>
@@ -1861,7 +1857,7 @@
                 <w:noProof/>
                 <w:webHidden/>
               </w:rPr>
-              <w:instrText xml:space="preserve"> PAGEREF _Toc226065918 \h </w:instrText>
+              <w:instrText xml:space="preserve"> PAGEREF _Toc226327482 \h </w:instrText>
             </w:r>
             <w:r>
               <w:rPr>
@@ -1906,7 +1902,7 @@
               <w14:ligatures w14:val="standardContextual"/>
             </w:rPr>
           </w:pPr>
-          <w:hyperlink w:anchor="_Toc226065919" w:history="1">
+          <w:hyperlink w:anchor="_Toc226327483" w:history="1">
             <w:r>
               <w:rPr>
                 <w:rStyle w:val="Hyperlink"/>
@@ -1934,7 +1930,7 @@
                 <w:noProof/>
                 <w:webHidden/>
               </w:rPr>
-              <w:instrText xml:space="preserve"> PAGEREF _Toc226065919 \h </w:instrText>
+              <w:instrText xml:space="preserve"> PAGEREF _Toc226327483 \h </w:instrText>
             </w:r>
             <w:r>
               <w:rPr>
@@ -1979,7 +1975,7 @@
               <w14:ligatures w14:val="standardContextual"/>
             </w:rPr>
           </w:pPr>
-          <w:hyperlink w:anchor="_Toc226065920" w:history="1">
+          <w:hyperlink w:anchor="_Toc226327484" w:history="1">
             <w:r>
               <w:rPr>
                 <w:rStyle w:val="Hyperlink"/>
@@ -2017,7 +2013,7 @@
                 <w:noProof/>
                 <w:webHidden/>
               </w:rPr>
-              <w:instrText xml:space="preserve"> PAGEREF _Toc226065920 \h </w:instrText>
+              <w:instrText xml:space="preserve"> PAGEREF _Toc226327484 \h </w:instrText>
             </w:r>
             <w:r>
               <w:rPr>
@@ -2062,7 +2058,7 @@
               <w14:ligatures w14:val="standardContextual"/>
             </w:rPr>
           </w:pPr>
-          <w:hyperlink w:anchor="_Toc226065921" w:history="1">
+          <w:hyperlink w:anchor="_Toc226327485" w:history="1">
             <w:r>
               <w:rPr>
                 <w:rStyle w:val="Hyperlink"/>
@@ -2100,7 +2096,7 @@
                 <w:noProof/>
                 <w:webHidden/>
               </w:rPr>
-              <w:instrText xml:space="preserve"> PAGEREF _Toc226065921 \h </w:instrText>
+              <w:instrText xml:space="preserve"> PAGEREF _Toc226327485 \h </w:instrText>
             </w:r>
             <w:r>
               <w:rPr>
@@ -2145,7 +2141,7 @@
               <w14:ligatures w14:val="standardContextual"/>
             </w:rPr>
           </w:pPr>
-          <w:hyperlink w:anchor="_Toc226065922" w:history="1">
+          <w:hyperlink w:anchor="_Toc226327486" w:history="1">
             <w:r>
               <w:rPr>
                 <w:rStyle w:val="Hyperlink"/>
@@ -2183,7 +2179,7 @@
                 <w:noProof/>
                 <w:webHidden/>
               </w:rPr>
-              <w:instrText xml:space="preserve"> PAGEREF _Toc226065922 \h </w:instrText>
+              <w:instrText xml:space="preserve"> PAGEREF _Toc226327486 \h </w:instrText>
             </w:r>
             <w:r>
               <w:rPr>
@@ -2228,7 +2224,7 @@
               <w14:ligatures w14:val="standardContextual"/>
             </w:rPr>
           </w:pPr>
-          <w:hyperlink w:anchor="_Toc226065923" w:history="1">
+          <w:hyperlink w:anchor="_Toc226327487" w:history="1">
             <w:r>
               <w:rPr>
                 <w:rStyle w:val="Hyperlink"/>
@@ -2256,7 +2252,7 @@
                 <w:noProof/>
                 <w:webHidden/>
               </w:rPr>
-              <w:instrText xml:space="preserve"> PAGEREF _Toc226065923 \h </w:instrText>
+              <w:instrText xml:space="preserve"> PAGEREF _Toc226327487 \h </w:instrText>
             </w:r>
             <w:r>
               <w:rPr>
@@ -2301,7 +2297,7 @@
               <w14:ligatures w14:val="standardContextual"/>
             </w:rPr>
           </w:pPr>
-          <w:hyperlink w:anchor="_Toc226065924" w:history="1">
+          <w:hyperlink w:anchor="_Toc226327488" w:history="1">
             <w:r>
               <w:rPr>
                 <w:rStyle w:val="Hyperlink"/>
@@ -2339,7 +2335,7 @@
                 <w:noProof/>
                 <w:webHidden/>
               </w:rPr>
-              <w:instrText xml:space="preserve"> PAGEREF _Toc226065924 \h </w:instrText>
+              <w:instrText xml:space="preserve"> PAGEREF _Toc226327488 \h </w:instrText>
             </w:r>
             <w:r>
               <w:rPr>
@@ -2384,7 +2380,7 @@
               <w14:ligatures w14:val="standardContextual"/>
             </w:rPr>
           </w:pPr>
-          <w:hyperlink w:anchor="_Toc226065925" w:history="1">
+          <w:hyperlink w:anchor="_Toc226327489" w:history="1">
             <w:r>
               <w:rPr>
                 <w:rStyle w:val="Hyperlink"/>
@@ -2446,7 +2442,7 @@
                 <w:noProof/>
                 <w:webHidden/>
               </w:rPr>
-              <w:instrText xml:space="preserve"> PAGEREF _Toc226065925 \h </w:instrText>
+              <w:instrText xml:space="preserve"> PAGEREF _Toc226327489 \h </w:instrText>
             </w:r>
             <w:r>
               <w:rPr>
@@ -2491,7 +2487,7 @@
               <w14:ligatures w14:val="standardContextual"/>
             </w:rPr>
           </w:pPr>
-          <w:hyperlink w:anchor="_Toc226065926" w:history="1">
+          <w:hyperlink w:anchor="_Toc226327490" w:history="1">
             <w:r>
               <w:rPr>
                 <w:rStyle w:val="Hyperlink"/>
@@ -2519,7 +2515,7 @@
                 <w:noProof/>
                 <w:webHidden/>
               </w:rPr>
-              <w:instrText xml:space="preserve"> PAGEREF _Toc226065926 \h </w:instrText>
+              <w:instrText xml:space="preserve"> PAGEREF _Toc226327490 \h </w:instrText>
             </w:r>
             <w:r>
               <w:rPr>
@@ -2564,7 +2560,7 @@
               <w14:ligatures w14:val="standardContextual"/>
             </w:rPr>
           </w:pPr>
-          <w:hyperlink w:anchor="_Toc226065927" w:history="1">
+          <w:hyperlink w:anchor="_Toc226327491" w:history="1">
             <w:r>
               <w:rPr>
                 <w:rStyle w:val="Hyperlink"/>
@@ -2592,7 +2588,7 @@
                 <w:noProof/>
                 <w:webHidden/>
               </w:rPr>
-              <w:instrText xml:space="preserve"> PAGEREF _Toc226065927 \h </w:instrText>
+              <w:instrText xml:space="preserve"> PAGEREF _Toc226327491 \h </w:instrText>
             </w:r>
             <w:r>
               <w:rPr>
@@ -2637,7 +2633,7 @@
               <w14:ligatures w14:val="standardContextual"/>
             </w:rPr>
           </w:pPr>
-          <w:hyperlink w:anchor="_Toc226065928" w:history="1">
+          <w:hyperlink w:anchor="_Toc226327492" w:history="1">
             <w:r>
               <w:rPr>
                 <w:rStyle w:val="Hyperlink"/>
@@ -2665,7 +2661,221 @@
                 <w:noProof/>
                 <w:webHidden/>
               </w:rPr>
-              <w:instrText xml:space="preserve"> PAGEREF _Toc226065928 \h </w:instrText>
+              <w:instrText xml:space="preserve"> PAGEREF _Toc226327492 \h </w:instrText>
+            </w:r>
+            <w:r>
+              <w:rPr>
+                <w:noProof/>
+                <w:webHidden/>
+              </w:rPr>
+            </w:r>
+            <w:r>
+              <w:rPr>
+                <w:noProof/>
+                <w:webHidden/>
+              </w:rPr>
+              <w:fldChar w:fldCharType="separate"/>
+            </w:r>
+            <w:r>
+              <w:rPr>
+                <w:noProof/>
+                <w:webHidden/>
+              </w:rPr>
+              <w:t>10</w:t>
+            </w:r>
+            <w:r>
+              <w:rPr>
+                <w:noProof/>
+                <w:webHidden/>
+              </w:rPr>
+              <w:fldChar w:fldCharType="end"/>
+            </w:r>
+          </w:hyperlink>
+        </w:p>
+        <w:p>
+          <w:pPr>
+            <w:pStyle w:val="TOC2"/>
+            <w:tabs>
+              <w:tab w:val="right" w:leader="dot" w:pos="8630"/>
+            </w:tabs>
+            <w:rPr>
+              <w:noProof/>
+              <w:kern w:val="2"/>
+              <w:sz w:val="24"/>
+              <w:szCs w:val="24"/>
+              <w14:ligatures w14:val="standardContextual"/>
+            </w:rPr>
+          </w:pPr>
+          <w:hyperlink w:anchor="_Toc226327493" w:history="1">
+            <w:r>
+              <w:rPr>
+                <w:rStyle w:val="Hyperlink"/>
+                <w:rFonts w:ascii="Segoe UI Emoji" w:hAnsi="Segoe UI Emoji" w:cs="Segoe UI Emoji"/>
+                <w:noProof/>
+              </w:rPr>
+              <w:t>🔹</w:t>
+            </w:r>
+            <w:r>
+              <w:rPr>
+                <w:rStyle w:val="Hyperlink"/>
+                <w:rFonts w:asciiTheme="minorBidi" w:hAnsiTheme="minorBidi"/>
+                <w:noProof/>
+              </w:rPr>
+              <w:t xml:space="preserve"> </w:t>
+            </w:r>
+            <w:r>
+              <w:rPr>
+                <w:rStyle w:val="Hyperlink"/>
+                <w:rFonts w:asciiTheme="minorBidi" w:hAnsiTheme="minorBidi"/>
+                <w:noProof/>
+                <w:lang w:bidi="ar-BH"/>
+              </w:rPr>
+              <w:t>4.2</w:t>
+            </w:r>
+            <w:r>
+              <w:rPr>
+                <w:rStyle w:val="Hyperlink"/>
+                <w:rFonts w:asciiTheme="minorBidi" w:hAnsiTheme="minorBidi"/>
+                <w:noProof/>
+              </w:rPr>
+              <w:t xml:space="preserve"> </w:t>
+            </w:r>
+            <w:r>
+              <w:rPr>
+                <w:rStyle w:val="Hyperlink"/>
+                <w:rFonts w:asciiTheme="minorBidi" w:hAnsiTheme="minorBidi"/>
+                <w:noProof/>
+                <w:lang w:bidi="ar-BH"/>
+              </w:rPr>
+              <w:t>Solution Overview</w:t>
+            </w:r>
+            <w:r>
+              <w:rPr>
+                <w:noProof/>
+                <w:webHidden/>
+              </w:rPr>
+              <w:tab/>
+            </w:r>
+            <w:r>
+              <w:rPr>
+                <w:noProof/>
+                <w:webHidden/>
+              </w:rPr>
+              <w:fldChar w:fldCharType="begin"/>
+            </w:r>
+            <w:r>
+              <w:rPr>
+                <w:noProof/>
+                <w:webHidden/>
+              </w:rPr>
+              <w:instrText xml:space="preserve"> PAGEREF _Toc226327493 \h </w:instrText>
+            </w:r>
+            <w:r>
+              <w:rPr>
+                <w:noProof/>
+                <w:webHidden/>
+              </w:rPr>
+            </w:r>
+            <w:r>
+              <w:rPr>
+                <w:noProof/>
+                <w:webHidden/>
+              </w:rPr>
+              <w:fldChar w:fldCharType="separate"/>
+            </w:r>
+            <w:r>
+              <w:rPr>
+                <w:noProof/>
+                <w:webHidden/>
+              </w:rPr>
+              <w:t>10</w:t>
+            </w:r>
+            <w:r>
+              <w:rPr>
+                <w:noProof/>
+                <w:webHidden/>
+              </w:rPr>
+              <w:fldChar w:fldCharType="end"/>
+            </w:r>
+          </w:hyperlink>
+        </w:p>
+        <w:p>
+          <w:pPr>
+            <w:pStyle w:val="TOC2"/>
+            <w:tabs>
+              <w:tab w:val="right" w:leader="dot" w:pos="8630"/>
+            </w:tabs>
+            <w:rPr>
+              <w:noProof/>
+              <w:kern w:val="2"/>
+              <w:sz w:val="24"/>
+              <w:szCs w:val="24"/>
+              <w14:ligatures w14:val="standardContextual"/>
+            </w:rPr>
+          </w:pPr>
+          <w:hyperlink w:anchor="_Toc226327494" w:history="1">
+            <w:r>
+              <w:rPr>
+                <w:rStyle w:val="Hyperlink"/>
+                <w:rFonts w:ascii="Segoe UI Emoji" w:hAnsi="Segoe UI Emoji" w:cs="Segoe UI Emoji"/>
+                <w:noProof/>
+              </w:rPr>
+              <w:t>🔹</w:t>
+            </w:r>
+            <w:r>
+              <w:rPr>
+                <w:rStyle w:val="Hyperlink"/>
+                <w:rFonts w:asciiTheme="minorBidi" w:hAnsiTheme="minorBidi"/>
+                <w:noProof/>
+              </w:rPr>
+              <w:t xml:space="preserve"> </w:t>
+            </w:r>
+            <w:r>
+              <w:rPr>
+                <w:rStyle w:val="Hyperlink"/>
+                <w:rFonts w:asciiTheme="minorBidi" w:hAnsiTheme="minorBidi"/>
+                <w:noProof/>
+                <w:lang w:bidi="ar-BH"/>
+              </w:rPr>
+              <w:t>6.2</w:t>
+            </w:r>
+            <w:r>
+              <w:rPr>
+                <w:rStyle w:val="Hyperlink"/>
+                <w:rFonts w:asciiTheme="minorBidi" w:hAnsiTheme="minorBidi"/>
+                <w:noProof/>
+              </w:rPr>
+              <w:t xml:space="preserve"> </w:t>
+            </w:r>
+            <w:r>
+              <w:rPr>
+                <w:rStyle w:val="Hyperlink"/>
+                <w:rFonts w:asciiTheme="minorBidi" w:hAnsiTheme="minorBidi"/>
+                <w:noProof/>
+                <w:lang w:bidi="ar-BH"/>
+              </w:rPr>
+              <w:t>System Architecture</w:t>
+            </w:r>
+            <w:r>
+              <w:rPr>
+                <w:noProof/>
+                <w:webHidden/>
+              </w:rPr>
+              <w:tab/>
+            </w:r>
+            <w:r>
+              <w:rPr>
+                <w:noProof/>
+                <w:webHidden/>
+              </w:rPr>
+              <w:fldChar w:fldCharType="begin"/>
+            </w:r>
+            <w:r>
+              <w:rPr>
+                <w:noProof/>
+                <w:webHidden/>
+              </w:rPr>
+              <w:instrText xml:space="preserve"> PAGEREF _Toc226327494 \h </w:instrText>
             </w:r>
             <w:r>
               <w:rPr>
@@ -2710,7 +2920,7 @@
               <w14:ligatures w14:val="standardContextual"/>
             </w:rPr>
           </w:pPr>
-          <w:hyperlink w:anchor="_Toc226065929" w:history="1">
+          <w:hyperlink w:anchor="_Toc226327495" w:history="1">
             <w:r>
               <w:rPr>
                 <w:rStyle w:val="Hyperlink"/>
@@ -2738,7 +2948,7 @@
                 <w:noProof/>
                 <w:webHidden/>
               </w:rPr>
-              <w:instrText xml:space="preserve"> PAGEREF _Toc226065929 \h </w:instrText>
+              <w:instrText xml:space="preserve"> PAGEREF _Toc226327495 \h </w:instrText>
             </w:r>
             <w:r>
               <w:rPr>
@@ -2783,7 +2993,7 @@
               <w14:ligatures w14:val="standardContextual"/>
             </w:rPr>
           </w:pPr>
-          <w:hyperlink w:anchor="_Toc226065930" w:history="1">
+          <w:hyperlink w:anchor="_Toc226327496" w:history="1">
             <w:r>
               <w:rPr>
                 <w:rStyle w:val="Hyperlink"/>
@@ -2811,7 +3021,7 @@
                 <w:noProof/>
                 <w:webHidden/>
               </w:rPr>
-              <w:instrText xml:space="preserve"> PAGEREF _Toc226065930 \h </w:instrText>
+              <w:instrText xml:space="preserve"> PAGEREF _Toc226327496 \h </w:instrText>
             </w:r>
             <w:r>
               <w:rPr>
@@ -2944,7 +3154,7 @@
               </w:rPr>
             </w:pPr>
             <w:bookmarkStart w:id="0" w:name="ProjectScope" w:colFirst="0" w:colLast="0"/>
-            <w:bookmarkStart w:id="1" w:name="_Toc226065911"/>
+            <w:bookmarkStart w:id="1" w:name="_Toc226327475"/>
             <w:r>
               <w:rPr>
                 <w:rFonts w:asciiTheme="minorBidi" w:hAnsiTheme="minorBidi" w:cstheme="minorBidi"/>
@@ -2983,7 +3193,7 @@
           <w:lang w:bidi="ar-BH"/>
         </w:rPr>
       </w:pPr>
-      <w:bookmarkStart w:id="2" w:name="_Toc226065912"/>
+      <w:bookmarkStart w:id="2" w:name="_Toc226327476"/>
       <w:bookmarkEnd w:id="0"/>
       <w:r>
         <w:rPr>
@@ -3116,7 +3326,6 @@
         <w:t xml:space="preserve">Home network design must balance performance and security. With a </w:t>
       </w:r>
       <w:proofErr w:type="spellStart"/>
-      <w:proofErr w:type="gramStart"/>
       <w:r>
         <w:rPr>
           <w:rFonts w:asciiTheme="minorBidi" w:hAnsiTheme="minorBidi"/>
@@ -3128,7 +3337,6 @@
         <w:t>well designed</w:t>
       </w:r>
       <w:proofErr w:type="spellEnd"/>
-      <w:proofErr w:type="gramEnd"/>
       <w:r>
         <w:rPr>
           <w:rFonts w:asciiTheme="minorBidi" w:hAnsiTheme="minorBidi"/>
@@ -3137,29 +3345,7 @@
           <w:szCs w:val="24"/>
           <w:lang w:bidi="ar-BH"/>
         </w:rPr>
-        <w:t xml:space="preserve"> home network, users can achieve superior performance and </w:t>
-      </w:r>
-      <w:proofErr w:type="gramStart"/>
-      <w:r>
-        <w:rPr>
-          <w:rFonts w:asciiTheme="minorBidi" w:hAnsiTheme="minorBidi"/>
-          <w:color w:val="000000" w:themeColor="text1"/>
-          <w:sz w:val="24"/>
-          <w:szCs w:val="24"/>
-          <w:lang w:bidi="ar-BH"/>
-        </w:rPr>
-        <w:t>a positive</w:t>
-      </w:r>
-      <w:proofErr w:type="gramEnd"/>
-      <w:r>
-        <w:rPr>
-          <w:rFonts w:asciiTheme="minorBidi" w:hAnsiTheme="minorBidi"/>
-          <w:color w:val="000000" w:themeColor="text1"/>
-          <w:sz w:val="24"/>
-          <w:szCs w:val="24"/>
-          <w:lang w:bidi="ar-BH"/>
-        </w:rPr>
-        <w:t xml:space="preserve"> user experience while keeping valuable data secure.</w:t>
+        <w:t xml:space="preserve"> home network, users can achieve superior performance and a positive user experience while keeping valuable data secure.</w:t>
       </w:r>
     </w:p>
     <w:p>
@@ -3173,7 +3359,7 @@
           <w:lang w:bidi="ar-BH"/>
         </w:rPr>
       </w:pPr>
-      <w:bookmarkStart w:id="3" w:name="_Toc226065913"/>
+      <w:bookmarkStart w:id="3" w:name="_Toc226327477"/>
       <w:r>
         <w:rPr>
           <w:rFonts w:ascii="Segoe UI Emoji" w:hAnsi="Segoe UI Emoji" w:cs="Segoe UI Emoji"/>
@@ -3222,19 +3408,8 @@
           <w:szCs w:val="24"/>
           <w:lang w:bidi="ar-BH"/>
         </w:rPr>
-        <w:t xml:space="preserve">The main objective of this project is to design a smart home network that is efficient, secure and safe. The specific objectives of the project </w:t>
+        <w:t>The main objective of this project is to design a smart home network that is efficient, secure and safe. The specific objectives of the project include;</w:t>
       </w:r>
-      <w:proofErr w:type="gramStart"/>
-      <w:r>
-        <w:rPr>
-          <w:rFonts w:asciiTheme="minorBidi" w:hAnsiTheme="minorBidi"/>
-          <w:sz w:val="24"/>
-          <w:szCs w:val="24"/>
-          <w:lang w:bidi="ar-BH"/>
-        </w:rPr>
-        <w:t>include;</w:t>
-      </w:r>
-      <w:proofErr w:type="gramEnd"/>
     </w:p>
     <w:p>
       <w:pPr>
@@ -3405,7 +3580,7 @@
           <w:lang w:bidi="ar-BH"/>
         </w:rPr>
       </w:pPr>
-      <w:bookmarkStart w:id="4" w:name="_Toc226065914"/>
+      <w:bookmarkStart w:id="4" w:name="_Toc226327478"/>
       <w:r>
         <w:rPr>
           <w:rFonts w:ascii="Segoe UI Emoji" w:hAnsi="Segoe UI Emoji" w:cs="Segoe UI Emoji"/>
@@ -3681,7 +3856,7 @@
                 <w:rFonts w:asciiTheme="minorBidi" w:hAnsiTheme="minorBidi" w:cstheme="minorBidi"/>
               </w:rPr>
             </w:pPr>
-            <w:bookmarkStart w:id="5" w:name="_Toc226065915"/>
+            <w:bookmarkStart w:id="5" w:name="_Toc226327479"/>
             <w:r>
               <w:rPr>
                 <w:rFonts w:asciiTheme="minorBidi" w:hAnsiTheme="minorBidi" w:cstheme="minorBidi"/>
@@ -3739,7 +3914,7 @@
           <w:szCs w:val="28"/>
         </w:rPr>
       </w:pPr>
-      <w:bookmarkStart w:id="6" w:name="_Toc226065916"/>
+      <w:bookmarkStart w:id="6" w:name="_Toc226327480"/>
       <w:r>
         <w:rPr>
           <w:rFonts w:ascii="Segoe UI Emoji" w:hAnsi="Segoe UI Emoji" w:cs="Segoe UI Emoji"/>
@@ -4001,7 +4176,7 @@
           <w:szCs w:val="28"/>
         </w:rPr>
       </w:pPr>
-      <w:bookmarkStart w:id="7" w:name="_Toc226065917"/>
+      <w:bookmarkStart w:id="7" w:name="_Toc226327481"/>
       <w:r>
         <w:rPr>
           <w:rFonts w:ascii="Segoe UI Emoji" w:hAnsi="Segoe UI Emoji" w:cs="Segoe UI Emoji"/>
@@ -4077,7 +4252,7 @@
           <w:szCs w:val="28"/>
         </w:rPr>
       </w:pPr>
-      <w:bookmarkStart w:id="8" w:name="_Toc226065918"/>
+      <w:bookmarkStart w:id="8" w:name="_Toc226327482"/>
       <w:r>
         <w:rPr>
           <w:rFonts w:ascii="Segoe UI Emoji" w:hAnsi="Segoe UI Emoji" w:cs="Segoe UI Emoji"/>
@@ -4344,30 +4519,14 @@
                 <w:rFonts w:asciiTheme="minorBidi" w:hAnsiTheme="minorBidi" w:cstheme="minorBidi"/>
               </w:rPr>
             </w:pPr>
-            <w:bookmarkStart w:id="9" w:name="_Toc226065919"/>
+            <w:bookmarkStart w:id="9" w:name="_Toc226327483"/>
             <w:r>
               <w:rPr>
                 <w:rFonts w:asciiTheme="minorBidi" w:hAnsiTheme="minorBidi" w:cstheme="minorBidi"/>
                 <w:color w:val="FFFFFF" w:themeColor="background1"/>
               </w:rPr>
               <w:lastRenderedPageBreak/>
-              <w:t xml:space="preserve">Section 3 – Project Plan </w:t>
-            </w:r>
-            <w:proofErr w:type="gramStart"/>
-            <w:r>
-              <w:rPr>
-                <w:rFonts w:asciiTheme="minorBidi" w:hAnsiTheme="minorBidi" w:cstheme="minorBidi"/>
-                <w:color w:val="FFFFFF" w:themeColor="background1"/>
-              </w:rPr>
-              <w:t>And</w:t>
-            </w:r>
-            <w:proofErr w:type="gramEnd"/>
-            <w:r>
-              <w:rPr>
-                <w:rFonts w:asciiTheme="minorBidi" w:hAnsiTheme="minorBidi" w:cstheme="minorBidi"/>
-                <w:color w:val="FFFFFF" w:themeColor="background1"/>
-              </w:rPr>
-              <w:t xml:space="preserve"> Stages</w:t>
+              <w:t>Section 3 – Project Plan And Stages</w:t>
             </w:r>
             <w:bookmarkEnd w:id="9"/>
           </w:p>
@@ -4385,7 +4544,7 @@
           <w:lang w:bidi="ar-BH"/>
         </w:rPr>
       </w:pPr>
-      <w:bookmarkStart w:id="10" w:name="_Toc226065920"/>
+      <w:bookmarkStart w:id="10" w:name="_Toc226327484"/>
       <w:r>
         <w:rPr>
           <w:rFonts w:ascii="Segoe UI Emoji" w:hAnsi="Segoe UI Emoji" w:cs="Segoe UI Emoji"/>
@@ -5389,7 +5548,7 @@
           <w:szCs w:val="28"/>
         </w:rPr>
       </w:pPr>
-      <w:bookmarkStart w:id="11" w:name="_Toc226065921"/>
+      <w:bookmarkStart w:id="11" w:name="_Toc226327485"/>
       <w:r>
         <w:rPr>
           <w:rFonts w:ascii="Segoe UI Emoji" w:hAnsi="Segoe UI Emoji" w:cs="Segoe UI Emoji"/>
@@ -8149,7 +8308,7 @@
           <w:szCs w:val="28"/>
         </w:rPr>
       </w:pPr>
-      <w:bookmarkStart w:id="12" w:name="_Toc226065922"/>
+      <w:bookmarkStart w:id="12" w:name="_Toc226327486"/>
       <w:r>
         <w:rPr>
           <w:rFonts w:ascii="Segoe UI Emoji" w:hAnsi="Segoe UI Emoji" w:cs="Segoe UI Emoji"/>
@@ -9272,18 +9431,8 @@
                 <w:sz w:val="18"/>
                 <w:szCs w:val="18"/>
               </w:rPr>
-              <w:t xml:space="preserve">2 </w:t>
-            </w:r>
-            <w:proofErr w:type="gramStart"/>
-            <w:r>
-              <w:rPr>
-                <w:rFonts w:ascii="Arial" w:eastAsia="Arial" w:hAnsi="Arial" w:cs="Arial"/>
-                <w:sz w:val="18"/>
-                <w:szCs w:val="18"/>
-              </w:rPr>
-              <w:t>day</w:t>
-            </w:r>
-            <w:proofErr w:type="gramEnd"/>
+              <w:t>2 day</w:t>
+            </w:r>
           </w:p>
         </w:tc>
         <w:tc>
@@ -9612,7 +9761,6 @@
                 <w:szCs w:val="18"/>
               </w:rPr>
             </w:pPr>
-            <w:proofErr w:type="gramStart"/>
             <w:r>
               <w:rPr>
                 <w:rFonts w:ascii="Arial" w:eastAsia="Arial" w:hAnsi="Arial" w:cs="Arial"/>
@@ -9627,16 +9775,7 @@
                 <w:sz w:val="18"/>
                 <w:szCs w:val="18"/>
               </w:rPr>
-              <w:t xml:space="preserve"> ,</w:t>
-            </w:r>
-            <w:proofErr w:type="gramEnd"/>
-            <w:r>
-              <w:rPr>
-                <w:rFonts w:ascii="Arial" w:eastAsia="Arial" w:hAnsi="Arial" w:cs="Arial"/>
-                <w:sz w:val="18"/>
-                <w:szCs w:val="18"/>
-              </w:rPr>
-              <w:t xml:space="preserve"> 4</w:t>
+              <w:t xml:space="preserve"> , 4</w:t>
             </w:r>
           </w:p>
         </w:tc>
@@ -11403,7 +11542,7 @@
                 <w:rFonts w:asciiTheme="minorBidi" w:hAnsiTheme="minorBidi" w:cstheme="minorBidi"/>
               </w:rPr>
             </w:pPr>
-            <w:bookmarkStart w:id="13" w:name="_Toc226065923"/>
+            <w:bookmarkStart w:id="13" w:name="_Toc226327487"/>
             <w:r>
               <w:rPr>
                 <w:rFonts w:asciiTheme="minorBidi" w:hAnsiTheme="minorBidi" w:cstheme="minorBidi"/>
@@ -11427,7 +11566,7 @@
           <w:lang w:bidi="ar-BH"/>
         </w:rPr>
       </w:pPr>
-      <w:bookmarkStart w:id="14" w:name="_Toc226065924"/>
+      <w:bookmarkStart w:id="14" w:name="_Toc226327488"/>
       <w:r>
         <w:rPr>
           <w:rFonts w:ascii="Segoe UI Emoji" w:hAnsi="Segoe UI Emoji" w:cs="Segoe UI Emoji"/>
@@ -12936,23 +13075,13 @@
                 <w:rFonts w:asciiTheme="minorBidi" w:hAnsiTheme="minorBidi"/>
               </w:rPr>
             </w:pPr>
-            <w:proofErr w:type="gramStart"/>
             <w:r>
               <w:rPr>
                 <w:rFonts w:asciiTheme="minorBidi" w:eastAsia="Arial" w:hAnsiTheme="minorBidi"/>
                 <w:sz w:val="18"/>
                 <w:szCs w:val="18"/>
               </w:rPr>
-              <w:t>S.Adam</w:t>
-            </w:r>
-            <w:proofErr w:type="gramEnd"/>
-            <w:r>
-              <w:rPr>
-                <w:rFonts w:asciiTheme="minorBidi" w:eastAsia="Arial" w:hAnsiTheme="minorBidi"/>
-                <w:sz w:val="18"/>
-                <w:szCs w:val="18"/>
-              </w:rPr>
-              <w:t xml:space="preserve"> A</w:t>
+              <w:t>S.Adam A</w:t>
             </w:r>
             <w:r>
               <w:rPr>
@@ -13999,7 +14128,7 @@
           <w:lang w:bidi="ar-BH"/>
         </w:rPr>
       </w:pPr>
-      <w:bookmarkStart w:id="15" w:name="_Toc226065925"/>
+      <w:bookmarkStart w:id="15" w:name="_Toc226327489"/>
       <w:r>
         <w:rPr>
           <w:rStyle w:val="Heading2Char"/>
@@ -14698,7 +14827,6 @@
               </w:rPr>
             </w:pPr>
             <w:proofErr w:type="spellStart"/>
-            <w:proofErr w:type="gramStart"/>
             <w:r>
               <w:rPr>
                 <w:rFonts w:asciiTheme="minorBidi" w:hAnsiTheme="minorBidi"/>
@@ -14710,7 +14838,6 @@
               <w:t>S.Adam</w:t>
             </w:r>
             <w:proofErr w:type="spellEnd"/>
-            <w:proofErr w:type="gramEnd"/>
             <w:r>
               <w:rPr>
                 <w:rFonts w:asciiTheme="minorBidi" w:hAnsiTheme="minorBidi"/>
@@ -14875,7 +15002,7 @@
                 <w:rFonts w:asciiTheme="minorBidi" w:hAnsiTheme="minorBidi" w:cstheme="minorBidi"/>
               </w:rPr>
             </w:pPr>
-            <w:bookmarkStart w:id="16" w:name="_Toc226065926"/>
+            <w:bookmarkStart w:id="16" w:name="_Toc226327490"/>
             <w:r>
               <w:rPr>
                 <w:rFonts w:asciiTheme="minorBidi" w:hAnsiTheme="minorBidi" w:cstheme="minorBidi"/>
@@ -14896,7 +15023,7 @@
           <w:lang w:bidi="ar-BH"/>
         </w:rPr>
       </w:pPr>
-      <w:bookmarkStart w:id="17" w:name="_Toc226065927"/>
+      <w:bookmarkStart w:id="17" w:name="_Toc226327491"/>
       <w:r>
         <w:rPr>
           <w:lang w:bidi="ar-BH"/>
@@ -15013,8 +15140,32 @@
                 <w:sz w:val="18"/>
                 <w:szCs w:val="18"/>
               </w:rPr>
-              <w:t xml:space="preserve">Haider </w:t>
-            </w:r>
+              <w:t>Haider (Project Manager)</w:t>
+            </w:r>
+          </w:p>
+        </w:tc>
+        <w:tc>
+          <w:tcPr>
+            <w:tcW w:w="1890" w:type="dxa"/>
+            <w:tcBorders>
+              <w:top w:val="single" w:sz="4" w:space="0" w:color="B8CCE4"/>
+              <w:left w:val="single" w:sz="4" w:space="0" w:color="B8CCE4"/>
+              <w:bottom w:val="single" w:sz="4" w:space="0" w:color="B8CCE4"/>
+              <w:right w:val="single" w:sz="4" w:space="0" w:color="B8CCE4"/>
+            </w:tcBorders>
+            <w:shd w:val="clear" w:color="auto" w:fill="2E75B6"/>
+            <w:tcMar>
+              <w:top w:w="80" w:type="dxa"/>
+              <w:left w:w="120" w:type="dxa"/>
+              <w:bottom w:w="80" w:type="dxa"/>
+              <w:right w:w="120" w:type="dxa"/>
+            </w:tcMar>
+            <w:vAlign w:val="center"/>
+          </w:tcPr>
+          <w:p>
+            <w:pPr>
+              <w:jc w:val="center"/>
+            </w:pPr>
             <w:r>
               <w:rPr>
                 <w:b/>
@@ -15023,7 +15174,7 @@
                 <w:sz w:val="18"/>
                 <w:szCs w:val="18"/>
               </w:rPr>
-              <w:t>(P</w:t>
+              <w:t>Yusif (</w:t>
             </w:r>
             <w:r>
               <w:rPr>
@@ -15033,7 +15184,7 @@
                 <w:sz w:val="18"/>
                 <w:szCs w:val="18"/>
               </w:rPr>
-              <w:t>roject Manager</w:t>
+              <w:t>Network Analyst &amp; Documentation</w:t>
             </w:r>
             <w:r>
               <w:rPr>
@@ -15049,7 +15200,7 @@
         </w:tc>
         <w:tc>
           <w:tcPr>
-            <w:tcW w:w="1890" w:type="dxa"/>
+            <w:tcW w:w="1710" w:type="dxa"/>
             <w:tcBorders>
               <w:top w:val="single" w:sz="4" w:space="0" w:color="B8CCE4"/>
               <w:left w:val="single" w:sz="4" w:space="0" w:color="B8CCE4"/>
@@ -15077,8 +15228,33 @@
                 <w:sz w:val="18"/>
                 <w:szCs w:val="18"/>
               </w:rPr>
-              <w:t>Yusif</w:t>
-            </w:r>
+              <w:t>Yassen (Network Designer)</w:t>
+            </w:r>
+          </w:p>
+        </w:tc>
+        <w:tc>
+          <w:tcPr>
+            <w:tcW w:w="2160" w:type="dxa"/>
+            <w:tcBorders>
+              <w:top w:val="single" w:sz="4" w:space="0" w:color="B8CCE4"/>
+              <w:left w:val="single" w:sz="4" w:space="0" w:color="B8CCE4"/>
+              <w:bottom w:val="single" w:sz="4" w:space="0" w:color="B8CCE4"/>
+              <w:right w:val="single" w:sz="4" w:space="0" w:color="B8CCE4"/>
+            </w:tcBorders>
+            <w:shd w:val="clear" w:color="auto" w:fill="2E75B6"/>
+            <w:tcMar>
+              <w:top w:w="80" w:type="dxa"/>
+              <w:left w:w="120" w:type="dxa"/>
+              <w:bottom w:w="80" w:type="dxa"/>
+              <w:right w:w="120" w:type="dxa"/>
+            </w:tcMar>
+            <w:vAlign w:val="center"/>
+          </w:tcPr>
+          <w:p>
+            <w:pPr>
+              <w:jc w:val="center"/>
+            </w:pPr>
+            <w:proofErr w:type="spellStart"/>
             <w:r>
               <w:rPr>
                 <w:b/>
@@ -15087,8 +15263,9 @@
                 <w:sz w:val="18"/>
                 <w:szCs w:val="18"/>
               </w:rPr>
-              <w:t xml:space="preserve"> (</w:t>
-            </w:r>
+              <w:t>S.Adam</w:t>
+            </w:r>
+            <w:proofErr w:type="spellEnd"/>
             <w:r>
               <w:rPr>
                 <w:b/>
@@ -15097,149 +15274,7 @@
                 <w:sz w:val="18"/>
                 <w:szCs w:val="18"/>
               </w:rPr>
-              <w:t>Network Analyst &amp; Documentation</w:t>
-            </w:r>
-            <w:r>
-              <w:rPr>
-                <w:b/>
-                <w:bCs/>
-                <w:color w:val="FFFFFF"/>
-                <w:sz w:val="18"/>
-                <w:szCs w:val="18"/>
-              </w:rPr>
-              <w:t>)</w:t>
-            </w:r>
-          </w:p>
-        </w:tc>
-        <w:tc>
-          <w:tcPr>
-            <w:tcW w:w="1710" w:type="dxa"/>
-            <w:tcBorders>
-              <w:top w:val="single" w:sz="4" w:space="0" w:color="B8CCE4"/>
-              <w:left w:val="single" w:sz="4" w:space="0" w:color="B8CCE4"/>
-              <w:bottom w:val="single" w:sz="4" w:space="0" w:color="B8CCE4"/>
-              <w:right w:val="single" w:sz="4" w:space="0" w:color="B8CCE4"/>
-            </w:tcBorders>
-            <w:shd w:val="clear" w:color="auto" w:fill="2E75B6"/>
-            <w:tcMar>
-              <w:top w:w="80" w:type="dxa"/>
-              <w:left w:w="120" w:type="dxa"/>
-              <w:bottom w:w="80" w:type="dxa"/>
-              <w:right w:w="120" w:type="dxa"/>
-            </w:tcMar>
-            <w:vAlign w:val="center"/>
-          </w:tcPr>
-          <w:p>
-            <w:pPr>
-              <w:jc w:val="center"/>
-            </w:pPr>
-            <w:r>
-              <w:rPr>
-                <w:b/>
-                <w:bCs/>
-                <w:color w:val="FFFFFF"/>
-                <w:sz w:val="18"/>
-                <w:szCs w:val="18"/>
-              </w:rPr>
-              <w:t>Yassen</w:t>
-            </w:r>
-            <w:r>
-              <w:rPr>
-                <w:b/>
-                <w:bCs/>
-                <w:color w:val="FFFFFF"/>
-                <w:sz w:val="18"/>
-                <w:szCs w:val="18"/>
-              </w:rPr>
-              <w:t xml:space="preserve"> (</w:t>
-            </w:r>
-            <w:r>
-              <w:rPr>
-                <w:b/>
-                <w:bCs/>
-                <w:color w:val="FFFFFF"/>
-                <w:sz w:val="18"/>
-                <w:szCs w:val="18"/>
-              </w:rPr>
-              <w:t>Network Designer</w:t>
-            </w:r>
-            <w:r>
-              <w:rPr>
-                <w:b/>
-                <w:bCs/>
-                <w:color w:val="FFFFFF"/>
-                <w:sz w:val="18"/>
-                <w:szCs w:val="18"/>
-              </w:rPr>
-              <w:t>)</w:t>
-            </w:r>
-          </w:p>
-        </w:tc>
-        <w:tc>
-          <w:tcPr>
-            <w:tcW w:w="2160" w:type="dxa"/>
-            <w:tcBorders>
-              <w:top w:val="single" w:sz="4" w:space="0" w:color="B8CCE4"/>
-              <w:left w:val="single" w:sz="4" w:space="0" w:color="B8CCE4"/>
-              <w:bottom w:val="single" w:sz="4" w:space="0" w:color="B8CCE4"/>
-              <w:right w:val="single" w:sz="4" w:space="0" w:color="B8CCE4"/>
-            </w:tcBorders>
-            <w:shd w:val="clear" w:color="auto" w:fill="2E75B6"/>
-            <w:tcMar>
-              <w:top w:w="80" w:type="dxa"/>
-              <w:left w:w="120" w:type="dxa"/>
-              <w:bottom w:w="80" w:type="dxa"/>
-              <w:right w:w="120" w:type="dxa"/>
-            </w:tcMar>
-            <w:vAlign w:val="center"/>
-          </w:tcPr>
-          <w:p>
-            <w:pPr>
-              <w:jc w:val="center"/>
-            </w:pPr>
-            <w:proofErr w:type="spellStart"/>
-            <w:proofErr w:type="gramStart"/>
-            <w:r>
-              <w:rPr>
-                <w:b/>
-                <w:bCs/>
-                <w:color w:val="FFFFFF"/>
-                <w:sz w:val="18"/>
-                <w:szCs w:val="18"/>
-              </w:rPr>
-              <w:t>S.Adam</w:t>
-            </w:r>
-            <w:proofErr w:type="spellEnd"/>
-            <w:proofErr w:type="gramEnd"/>
-            <w:r>
-              <w:rPr>
-                <w:b/>
-                <w:bCs/>
-                <w:color w:val="FFFFFF"/>
-                <w:sz w:val="18"/>
-                <w:szCs w:val="18"/>
-              </w:rPr>
-              <w:t xml:space="preserve"> (</w:t>
-            </w:r>
-            <w:r>
-              <w:rPr>
-                <w:b/>
-                <w:bCs/>
-                <w:color w:val="FFFFFF"/>
-                <w:sz w:val="18"/>
-                <w:szCs w:val="18"/>
-              </w:rPr>
-              <w:t>Network Engineer</w:t>
-            </w:r>
-            <w:r>
-              <w:rPr>
-                <w:b/>
-                <w:bCs/>
-                <w:color w:val="FFFFFF"/>
-                <w:sz w:val="18"/>
-                <w:szCs w:val="18"/>
-              </w:rPr>
-              <w:t>)</w:t>
+              <w:t xml:space="preserve"> (Network Engineer)</w:t>
             </w:r>
           </w:p>
         </w:tc>
@@ -17008,7 +17043,7 @@
     </w:p>
     <w:tbl>
       <w:tblPr>
-        <w:tblW w:w="0" w:type="auto"/>
+        <w:tblW w:w="9360" w:type="dxa"/>
         <w:tblBorders>
           <w:top w:val="single" w:sz="4" w:space="0" w:color="auto"/>
           <w:left w:val="single" w:sz="4" w:space="0" w:color="auto"/>
@@ -17054,7 +17089,7 @@
                 <w:rFonts w:asciiTheme="minorBidi" w:hAnsiTheme="minorBidi" w:cstheme="minorBidi"/>
               </w:rPr>
             </w:pPr>
-            <w:bookmarkStart w:id="18" w:name="_Toc226065928"/>
+            <w:bookmarkStart w:id="18" w:name="_Toc226327492"/>
             <w:r>
               <w:rPr>
                 <w:rFonts w:asciiTheme="minorBidi" w:hAnsiTheme="minorBidi" w:cstheme="minorBidi"/>
@@ -17078,11 +17113,201 @@
     </w:p>
     <w:p>
       <w:pPr>
+        <w:pStyle w:val="Heading2"/>
+        <w:spacing w:after="240"/>
         <w:rPr>
-          <w:rFonts w:asciiTheme="minorBidi" w:hAnsiTheme="minorBidi"/>
+          <w:rStyle w:val="Heading2Char"/>
+          <w:rFonts w:asciiTheme="minorBidi" w:hAnsiTheme="minorBidi" w:cstheme="minorBidi"/>
+          <w:b/>
+          <w:bCs/>
+          <w:sz w:val="28"/>
+          <w:szCs w:val="28"/>
           <w:lang w:bidi="ar-BH"/>
         </w:rPr>
       </w:pPr>
+      <w:bookmarkStart w:id="19" w:name="_Toc226327493"/>
+      <w:r>
+        <w:rPr>
+          <w:rStyle w:val="Heading2Char"/>
+          <w:rFonts w:ascii="Segoe UI Emoji" w:hAnsi="Segoe UI Emoji" w:cs="Segoe UI Emoji"/>
+          <w:sz w:val="28"/>
+          <w:szCs w:val="28"/>
+        </w:rPr>
+        <w:t>🔹</w:t>
+      </w:r>
+      <w:r>
+        <w:rPr>
+          <w:rStyle w:val="Heading2Char"/>
+          <w:rFonts w:asciiTheme="minorBidi" w:hAnsiTheme="minorBidi" w:cstheme="minorBidi"/>
+          <w:sz w:val="28"/>
+          <w:szCs w:val="28"/>
+        </w:rPr>
+        <w:t xml:space="preserve"> </w:t>
+      </w:r>
+      <w:r>
+        <w:rPr>
+          <w:rStyle w:val="Heading2Char"/>
+          <w:rFonts w:asciiTheme="minorBidi" w:hAnsiTheme="minorBidi" w:cstheme="minorBidi"/>
+          <w:b/>
+          <w:bCs/>
+          <w:sz w:val="28"/>
+          <w:szCs w:val="28"/>
+          <w:lang w:bidi="ar-BH"/>
+        </w:rPr>
+        <w:t>4.2</w:t>
+      </w:r>
+      <w:r>
+        <w:rPr>
+          <w:rStyle w:val="Heading2Char"/>
+          <w:rFonts w:asciiTheme="minorBidi" w:hAnsiTheme="minorBidi" w:cstheme="minorBidi"/>
+          <w:sz w:val="28"/>
+          <w:szCs w:val="28"/>
+        </w:rPr>
+        <w:t xml:space="preserve"> </w:t>
+      </w:r>
+      <w:r>
+        <w:rPr>
+          <w:rStyle w:val="Heading2Char"/>
+          <w:rFonts w:asciiTheme="minorBidi" w:hAnsiTheme="minorBidi" w:cstheme="minorBidi"/>
+          <w:b/>
+          <w:bCs/>
+          <w:sz w:val="28"/>
+          <w:szCs w:val="28"/>
+          <w:lang w:bidi="ar-BH"/>
+        </w:rPr>
+        <w:t>Solution Overview</w:t>
+      </w:r>
+      <w:bookmarkEnd w:id="19"/>
+    </w:p>
+    <w:p>
+      <w:pPr>
+        <w:pStyle w:val="Heading2"/>
+        <w:spacing w:after="240"/>
+        <w:rPr>
+          <w:rFonts w:asciiTheme="minorBidi" w:eastAsiaTheme="minorEastAsia" w:hAnsiTheme="minorBidi" w:cstheme="minorBidi"/>
+          <w:b w:val="0"/>
+          <w:bCs w:val="0"/>
+          <w:color w:val="auto"/>
+          <w:sz w:val="22"/>
+          <w:szCs w:val="22"/>
+          <w:lang w:bidi="ar-BH"/>
+        </w:rPr>
+      </w:pPr>
+      <w:bookmarkStart w:id="20" w:name="_Toc226327494"/>
+      <w:r>
+        <w:rPr>
+          <w:rFonts w:asciiTheme="minorBidi" w:eastAsiaTheme="minorEastAsia" w:hAnsiTheme="minorBidi" w:cstheme="minorBidi"/>
+          <w:b w:val="0"/>
+          <w:bCs w:val="0"/>
+          <w:color w:val="auto"/>
+          <w:sz w:val="22"/>
+          <w:szCs w:val="22"/>
+          <w:lang w:bidi="ar-BH"/>
+        </w:rPr>
+        <w:t>The Smart Home Network Design is a project where a structured home network is designed and implemented to efficiently connect all devices within a house, supporting both wired and wireless connections to enable reliable internet access to computers, smartphones, tablets and smart home devices.</w:t>
+      </w:r>
+    </w:p>
+    <w:p>
+      <w:pPr>
+        <w:pStyle w:val="Heading2"/>
+        <w:spacing w:after="240"/>
+        <w:rPr>
+          <w:rFonts w:asciiTheme="minorBidi" w:eastAsiaTheme="minorEastAsia" w:hAnsiTheme="minorBidi" w:cstheme="minorBidi"/>
+          <w:b w:val="0"/>
+          <w:bCs w:val="0"/>
+          <w:color w:val="auto"/>
+          <w:sz w:val="22"/>
+          <w:szCs w:val="22"/>
+          <w:lang w:bidi="ar-BH"/>
+        </w:rPr>
+      </w:pPr>
+      <w:r>
+        <w:rPr>
+          <w:rFonts w:asciiTheme="minorBidi" w:eastAsiaTheme="minorEastAsia" w:hAnsiTheme="minorBidi" w:cstheme="minorBidi"/>
+          <w:b w:val="0"/>
+          <w:bCs w:val="0"/>
+          <w:color w:val="auto"/>
+          <w:sz w:val="22"/>
+          <w:szCs w:val="22"/>
+          <w:lang w:bidi="ar-BH"/>
+        </w:rPr>
+        <w:t>The design tackles network performance, reliability, and incorporates basic security to improve the users experience.</w:t>
+      </w:r>
+    </w:p>
+    <w:p>
+      <w:pPr>
+        <w:pStyle w:val="Heading2"/>
+        <w:spacing w:after="240"/>
+        <w:rPr>
+          <w:rStyle w:val="Heading2Char"/>
+          <w:rFonts w:asciiTheme="minorBidi" w:eastAsiaTheme="minorEastAsia" w:hAnsiTheme="minorBidi" w:cstheme="minorBidi"/>
+          <w:color w:val="auto"/>
+          <w:sz w:val="22"/>
+          <w:szCs w:val="22"/>
+          <w:lang w:bidi="ar-BH"/>
+        </w:rPr>
+      </w:pPr>
+      <w:r>
+        <w:rPr>
+          <w:rStyle w:val="Heading2Char"/>
+          <w:rFonts w:ascii="Segoe UI Emoji" w:hAnsi="Segoe UI Emoji" w:cs="Segoe UI Emoji"/>
+          <w:sz w:val="28"/>
+          <w:szCs w:val="28"/>
+        </w:rPr>
+        <w:t>🔹</w:t>
+      </w:r>
+      <w:r>
+        <w:rPr>
+          <w:rStyle w:val="Heading2Char"/>
+          <w:rFonts w:asciiTheme="minorBidi" w:hAnsiTheme="minorBidi" w:cstheme="minorBidi"/>
+          <w:sz w:val="28"/>
+          <w:szCs w:val="28"/>
+        </w:rPr>
+        <w:t xml:space="preserve"> </w:t>
+      </w:r>
+      <w:r>
+        <w:rPr>
+          <w:rStyle w:val="Heading2Char"/>
+          <w:rFonts w:asciiTheme="minorBidi" w:hAnsiTheme="minorBidi" w:cstheme="minorBidi"/>
+          <w:b/>
+          <w:bCs/>
+          <w:sz w:val="28"/>
+          <w:szCs w:val="28"/>
+          <w:lang w:bidi="ar-BH"/>
+        </w:rPr>
+        <w:t>6</w:t>
+      </w:r>
+      <w:r>
+        <w:rPr>
+          <w:rStyle w:val="Heading2Char"/>
+          <w:rFonts w:asciiTheme="minorBidi" w:hAnsiTheme="minorBidi" w:cstheme="minorBidi"/>
+          <w:b/>
+          <w:bCs/>
+          <w:sz w:val="28"/>
+          <w:szCs w:val="28"/>
+          <w:lang w:bidi="ar-BH"/>
+        </w:rPr>
+        <w:t>.2</w:t>
+      </w:r>
+      <w:r>
+        <w:rPr>
+          <w:rStyle w:val="Heading2Char"/>
+          <w:rFonts w:asciiTheme="minorBidi" w:hAnsiTheme="minorBidi" w:cstheme="minorBidi"/>
+          <w:sz w:val="28"/>
+          <w:szCs w:val="28"/>
+        </w:rPr>
+        <w:t xml:space="preserve"> </w:t>
+      </w:r>
+      <w:r>
+        <w:rPr>
+          <w:rFonts w:asciiTheme="minorBidi" w:hAnsiTheme="minorBidi" w:cstheme="minorBidi"/>
+          <w:sz w:val="28"/>
+          <w:szCs w:val="28"/>
+          <w:lang w:bidi="ar-BH"/>
+        </w:rPr>
+        <w:t>System Architecture</w:t>
+      </w:r>
+      <w:bookmarkEnd w:id="20"/>
     </w:p>
     <w:p>
       <w:pPr>
@@ -17091,6 +17316,29 @@
           <w:lang w:bidi="ar-BH"/>
         </w:rPr>
       </w:pPr>
+      <w:r>
+        <w:rPr>
+          <w:rFonts w:asciiTheme="minorBidi" w:hAnsiTheme="minorBidi"/>
+          <w:lang w:bidi="ar-BH"/>
+        </w:rPr>
+        <w:t xml:space="preserve">The network is based on a </w:t>
+      </w:r>
+      <w:r>
+        <w:rPr>
+          <w:rFonts w:asciiTheme="minorBidi" w:hAnsiTheme="minorBidi"/>
+          <w:b/>
+          <w:bCs/>
+          <w:lang w:bidi="ar-BH"/>
+        </w:rPr>
+        <w:t>star topology</w:t>
+      </w:r>
+      <w:r>
+        <w:rPr>
+          <w:rFonts w:asciiTheme="minorBidi" w:hAnsiTheme="minorBidi"/>
+          <w:lang w:bidi="ar-BH"/>
+        </w:rPr>
+        <w:t>, where all devices connect through a central router and switch.</w:t>
+      </w:r>
     </w:p>
     <w:p>
       <w:pPr>
@@ -17099,91 +17347,213 @@
           <w:lang w:bidi="ar-BH"/>
         </w:rPr>
       </w:pPr>
+      <w:r>
+        <w:rPr>
+          <w:rFonts w:asciiTheme="minorBidi" w:hAnsiTheme="minorBidi"/>
+          <w:lang w:bidi="ar-BH"/>
+        </w:rPr>
+        <w:t>Main components include:</w:t>
+      </w:r>
     </w:p>
     <w:p>
       <w:pPr>
+        <w:numPr>
+          <w:ilvl w:val="0"/>
+          <w:numId w:val="16"/>
+        </w:numPr>
         <w:rPr>
           <w:rFonts w:asciiTheme="minorBidi" w:hAnsiTheme="minorBidi"/>
           <w:lang w:bidi="ar-BH"/>
         </w:rPr>
       </w:pPr>
+      <w:r>
+        <w:rPr>
+          <w:rFonts w:asciiTheme="minorBidi" w:hAnsiTheme="minorBidi"/>
+          <w:b/>
+          <w:bCs/>
+          <w:lang w:bidi="ar-BH"/>
+        </w:rPr>
+        <w:t>Router:</w:t>
+      </w:r>
+      <w:r>
+        <w:rPr>
+          <w:rFonts w:asciiTheme="minorBidi" w:hAnsiTheme="minorBidi"/>
+          <w:lang w:bidi="ar-BH"/>
+        </w:rPr>
+        <w:t xml:space="preserve"> Connects the home network to the internet and manages traffic </w:t>
+      </w:r>
     </w:p>
     <w:p>
       <w:pPr>
+        <w:numPr>
+          <w:ilvl w:val="0"/>
+          <w:numId w:val="16"/>
+        </w:numPr>
         <w:rPr>
           <w:rFonts w:asciiTheme="minorBidi" w:hAnsiTheme="minorBidi"/>
           <w:lang w:bidi="ar-BH"/>
         </w:rPr>
       </w:pPr>
+      <w:r>
+        <w:rPr>
+          <w:rFonts w:asciiTheme="minorBidi" w:hAnsiTheme="minorBidi"/>
+          <w:b/>
+          <w:bCs/>
+          <w:lang w:bidi="ar-BH"/>
+        </w:rPr>
+        <w:t>Switch:</w:t>
+      </w:r>
+      <w:r>
+        <w:rPr>
+          <w:rFonts w:asciiTheme="minorBidi" w:hAnsiTheme="minorBidi"/>
+          <w:lang w:bidi="ar-BH"/>
+        </w:rPr>
+        <w:t xml:space="preserve"> Connects wired devices such as PCs and smart TVs </w:t>
+      </w:r>
     </w:p>
     <w:p>
       <w:pPr>
+        <w:numPr>
+          <w:ilvl w:val="0"/>
+          <w:numId w:val="16"/>
+        </w:numPr>
         <w:rPr>
           <w:rFonts w:asciiTheme="minorBidi" w:hAnsiTheme="minorBidi"/>
           <w:lang w:bidi="ar-BH"/>
         </w:rPr>
       </w:pPr>
+      <w:r>
+        <w:rPr>
+          <w:rFonts w:asciiTheme="minorBidi" w:hAnsiTheme="minorBidi"/>
+          <w:b/>
+          <w:bCs/>
+          <w:lang w:bidi="ar-BH"/>
+        </w:rPr>
+        <w:t>Wireless Access Point:</w:t>
+      </w:r>
+      <w:r>
+        <w:rPr>
+          <w:rFonts w:asciiTheme="minorBidi" w:hAnsiTheme="minorBidi"/>
+          <w:lang w:bidi="ar-BH"/>
+        </w:rPr>
+        <w:t xml:space="preserve"> Provides Wi-Fi connectivity </w:t>
+      </w:r>
     </w:p>
     <w:p>
       <w:pPr>
+        <w:numPr>
+          <w:ilvl w:val="0"/>
+          <w:numId w:val="16"/>
+        </w:numPr>
         <w:rPr>
           <w:rFonts w:asciiTheme="minorBidi" w:hAnsiTheme="minorBidi"/>
           <w:lang w:bidi="ar-BH"/>
         </w:rPr>
       </w:pPr>
+      <w:r>
+        <w:rPr>
+          <w:rFonts w:asciiTheme="minorBidi" w:hAnsiTheme="minorBidi"/>
+          <w:b/>
+          <w:bCs/>
+          <w:lang w:bidi="ar-BH"/>
+        </w:rPr>
+        <w:t>End Devices:</w:t>
+      </w:r>
+      <w:r>
+        <w:rPr>
+          <w:rFonts w:asciiTheme="minorBidi" w:hAnsiTheme="minorBidi"/>
+          <w:lang w:bidi="ar-BH"/>
+        </w:rPr>
+        <w:t xml:space="preserve"> Includes smartphones, laptops, and IoT devices</w:t>
+      </w:r>
+    </w:p>
+    <w:p>
+      <w:pPr>
+        <w:pStyle w:val="Heading2"/>
+        <w:spacing w:after="240"/>
+        <w:rPr>
+          <w:rFonts w:asciiTheme="minorBidi" w:hAnsiTheme="minorBidi" w:cstheme="minorBidi"/>
+          <w:sz w:val="28"/>
+          <w:szCs w:val="28"/>
+          <w:lang w:bidi="ar-BH"/>
+        </w:rPr>
+      </w:pPr>
+      <w:r>
+        <w:rPr>
+          <w:rStyle w:val="Heading2Char"/>
+          <w:rFonts w:ascii="Segoe UI Emoji" w:hAnsi="Segoe UI Emoji" w:cs="Segoe UI Emoji"/>
+          <w:sz w:val="28"/>
+          <w:szCs w:val="28"/>
+        </w:rPr>
+        <w:t>🔹</w:t>
+      </w:r>
+      <w:r>
+        <w:rPr>
+          <w:rStyle w:val="Heading2Char"/>
+          <w:rFonts w:asciiTheme="minorBidi" w:hAnsiTheme="minorBidi" w:cstheme="minorBidi"/>
+          <w:sz w:val="28"/>
+          <w:szCs w:val="28"/>
+        </w:rPr>
+        <w:t xml:space="preserve"> </w:t>
+      </w:r>
+      <w:r>
+        <w:rPr>
+          <w:rStyle w:val="Heading2Char"/>
+          <w:rFonts w:asciiTheme="minorBidi" w:hAnsiTheme="minorBidi" w:cstheme="minorBidi"/>
+          <w:b/>
+          <w:bCs/>
+          <w:sz w:val="28"/>
+          <w:szCs w:val="28"/>
+          <w:lang w:bidi="ar-BH"/>
+        </w:rPr>
+        <w:t>6</w:t>
+      </w:r>
+      <w:r>
+        <w:rPr>
+          <w:rStyle w:val="Heading2Char"/>
+          <w:rFonts w:asciiTheme="minorBidi" w:hAnsiTheme="minorBidi" w:cstheme="minorBidi"/>
+          <w:b/>
+          <w:bCs/>
+          <w:sz w:val="28"/>
+          <w:szCs w:val="28"/>
+          <w:lang w:bidi="ar-BH"/>
+        </w:rPr>
+        <w:t>.</w:t>
+      </w:r>
+      <w:r>
+        <w:rPr>
+          <w:rStyle w:val="Heading2Char"/>
+          <w:rFonts w:asciiTheme="minorBidi" w:hAnsiTheme="minorBidi" w:cstheme="minorBidi"/>
+          <w:b/>
+          <w:bCs/>
+          <w:sz w:val="28"/>
+          <w:szCs w:val="28"/>
+          <w:lang w:bidi="ar-BH"/>
+        </w:rPr>
+        <w:t>3</w:t>
+      </w:r>
+      <w:r>
+        <w:rPr>
+          <w:rStyle w:val="Heading2Char"/>
+          <w:rFonts w:asciiTheme="minorBidi" w:hAnsiTheme="minorBidi" w:cstheme="minorBidi"/>
+          <w:sz w:val="28"/>
+          <w:szCs w:val="28"/>
+        </w:rPr>
+        <w:t xml:space="preserve"> </w:t>
+      </w:r>
+      <w:r>
+        <w:rPr>
+          <w:rFonts w:asciiTheme="minorBidi" w:hAnsiTheme="minorBidi" w:cstheme="minorBidi"/>
+          <w:sz w:val="28"/>
+          <w:szCs w:val="28"/>
+          <w:lang w:bidi="ar-BH"/>
+        </w:rPr>
+        <w:t>Network Diagram</w:t>
+      </w:r>
     </w:p>
     <w:p>
       <w:pPr>
         <w:rPr>
-          <w:rFonts w:asciiTheme="minorBidi" w:hAnsiTheme="minorBidi"/>
-          <w:lang w:bidi="ar-BH"/>
-        </w:rPr>
-      </w:pPr>
-    </w:p>
-    <w:p>
-      <w:pPr>
-        <w:rPr>
-          <w:rFonts w:asciiTheme="minorBidi" w:hAnsiTheme="minorBidi"/>
-          <w:lang w:bidi="ar-BH"/>
-        </w:rPr>
-      </w:pPr>
-    </w:p>
-    <w:p>
-      <w:pPr>
-        <w:rPr>
-          <w:rFonts w:asciiTheme="minorBidi" w:hAnsiTheme="minorBidi"/>
-          <w:lang w:bidi="ar-BH"/>
-        </w:rPr>
-      </w:pPr>
-    </w:p>
-    <w:p>
-      <w:pPr>
-        <w:rPr>
-          <w:rFonts w:asciiTheme="minorBidi" w:hAnsiTheme="minorBidi"/>
-          <w:lang w:bidi="ar-BH"/>
-        </w:rPr>
-      </w:pPr>
-    </w:p>
-    <w:p>
-      <w:pPr>
-        <w:rPr>
-          <w:rFonts w:asciiTheme="minorBidi" w:hAnsiTheme="minorBidi"/>
-          <w:lang w:bidi="ar-BH"/>
-        </w:rPr>
-      </w:pPr>
-    </w:p>
-    <w:p>
-      <w:pPr>
-        <w:rPr>
-          <w:rFonts w:asciiTheme="minorBidi" w:hAnsiTheme="minorBidi"/>
-          <w:lang w:bidi="ar-BH"/>
-        </w:rPr>
-      </w:pPr>
-    </w:p>
-    <w:p>
-      <w:pPr>
-        <w:rPr>
-          <w:rFonts w:asciiTheme="minorBidi" w:hAnsiTheme="minorBidi"/>
           <w:lang w:bidi="ar-BH"/>
         </w:rPr>
       </w:pPr>
@@ -17309,16 +17679,15 @@
                 <w:color w:val="FFFFFF" w:themeColor="background1"/>
               </w:rPr>
             </w:pPr>
-            <w:bookmarkStart w:id="19" w:name="_Toc226065929"/>
+            <w:bookmarkStart w:id="21" w:name="_Toc226327495"/>
             <w:r>
               <w:rPr>
                 <w:rFonts w:asciiTheme="minorBidi" w:hAnsiTheme="minorBidi" w:cstheme="minorBidi"/>
                 <w:color w:val="FFFFFF" w:themeColor="background1"/>
               </w:rPr>
-              <w:lastRenderedPageBreak/>
               <w:t>Section 7 - Conclusion and Future Steps</w:t>
             </w:r>
-            <w:bookmarkEnd w:id="19"/>
+            <w:bookmarkEnd w:id="21"/>
           </w:p>
         </w:tc>
       </w:tr>
@@ -17395,7 +17764,7 @@
                 <w:color w:val="FFFFFF" w:themeColor="background1"/>
               </w:rPr>
             </w:pPr>
-            <w:bookmarkStart w:id="20" w:name="_Toc226065930"/>
+            <w:bookmarkStart w:id="22" w:name="_Toc226327496"/>
             <w:r>
               <w:rPr>
                 <w:rFonts w:asciiTheme="minorBidi" w:hAnsiTheme="minorBidi" w:cstheme="minorBidi"/>
@@ -17404,7 +17773,7 @@
               <w:lastRenderedPageBreak/>
               <w:t>Appendices</w:t>
             </w:r>
-            <w:bookmarkEnd w:id="20"/>
+            <w:bookmarkEnd w:id="22"/>
           </w:p>
         </w:tc>
       </w:tr>
@@ -18196,6 +18565,119 @@
     </w:lvl>
   </w:abstractNum>
   <w:abstractNum w:abstractNumId="13" w15:restartNumberingAfterBreak="0">
+    <w:nsid w:val="6EB97DA7"/>
+    <w:multiLevelType w:val="hybridMultilevel"/>
+    <w:tmpl w:val="F68E2D26"/>
+    <w:lvl w:ilvl="0" w:tplc="04090001">
+      <w:start w:val="1"/>
+      <w:numFmt w:val="bullet"/>
+      <w:lvlText w:val=""/>
+      <w:lvlJc w:val="left"/>
+      <w:pPr>
+        <w:ind w:left="720" w:hanging="360"/>
+      </w:pPr>
+      <w:rPr>
+        <w:rFonts w:ascii="Symbol" w:hAnsi="Symbol" w:hint="default"/>
+      </w:rPr>
+    </w:lvl>
+    <w:lvl w:ilvl="1" w:tplc="04090003" w:tentative="1">
+      <w:start w:val="1"/>
+      <w:numFmt w:val="bullet"/>
+      <w:lvlText w:val="o"/>
+      <w:lvlJc w:val="left"/>
+      <w:pPr>
+        <w:ind w:left="1440" w:hanging="360"/>
+      </w:pPr>
+      <w:rPr>
+        <w:rFonts w:ascii="Courier New" w:hAnsi="Courier New" w:cs="Courier New" w:hint="default"/>
+      </w:rPr>
+    </w:lvl>
+    <w:lvl w:ilvl="2" w:tplc="04090005" w:tentative="1">
+      <w:start w:val="1"/>
+      <w:numFmt w:val="bullet"/>
+      <w:lvlText w:val=""/>
+      <w:lvlJc w:val="left"/>
+      <w:pPr>
+        <w:ind w:left="2160" w:hanging="360"/>
+      </w:pPr>
+      <w:rPr>
+        <w:rFonts w:ascii="Wingdings" w:hAnsi="Wingdings" w:hint="default"/>
+      </w:rPr>
+    </w:lvl>
+    <w:lvl w:ilvl="3" w:tplc="04090001" w:tentative="1">
+      <w:start w:val="1"/>
+      <w:numFmt w:val="bullet"/>
+      <w:lvlText w:val=""/>
+      <w:lvlJc w:val="left"/>
+      <w:pPr>
+        <w:ind w:left="2880" w:hanging="360"/>
+      </w:pPr>
+      <w:rPr>
+        <w:rFonts w:ascii="Symbol" w:hAnsi="Symbol" w:hint="default"/>
+      </w:rPr>
+    </w:lvl>
+    <w:lvl w:ilvl="4" w:tplc="04090003" w:tentative="1">
+      <w:start w:val="1"/>
+      <w:numFmt w:val="bullet"/>
+      <w:lvlText w:val="o"/>
+      <w:lvlJc w:val="left"/>
+      <w:pPr>
+        <w:ind w:left="3600" w:hanging="360"/>
+      </w:pPr>
+      <w:rPr>
+        <w:rFonts w:ascii="Courier New" w:hAnsi="Courier New" w:cs="Courier New" w:hint="default"/>
+      </w:rPr>
+    </w:lvl>
+    <w:lvl w:ilvl="5" w:tplc="04090005" w:tentative="1">
+      <w:start w:val="1"/>
+      <w:numFmt w:val="bullet"/>
+      <w:lvlText w:val=""/>
+      <w:lvlJc w:val="left"/>
+      <w:pPr>
+        <w:ind w:left="4320" w:hanging="360"/>
+      </w:pPr>
+      <w:rPr>
+        <w:rFonts w:ascii="Wingdings" w:hAnsi="Wingdings" w:hint="default"/>
+      </w:rPr>
+    </w:lvl>
+    <w:lvl w:ilvl="6" w:tplc="04090001" w:tentative="1">
+      <w:start w:val="1"/>
+      <w:numFmt w:val="bullet"/>
+      <w:lvlText w:val=""/>
+      <w:lvlJc w:val="left"/>
+      <w:pPr>
+        <w:ind w:left="5040" w:hanging="360"/>
+      </w:pPr>
+      <w:rPr>
+        <w:rFonts w:ascii="Symbol" w:hAnsi="Symbol" w:hint="default"/>
+      </w:rPr>
+    </w:lvl>
+    <w:lvl w:ilvl="7" w:tplc="04090003" w:tentative="1">
+      <w:start w:val="1"/>
+      <w:numFmt w:val="bullet"/>
+      <w:lvlText w:val="o"/>
+      <w:lvlJc w:val="left"/>
+      <w:pPr>
+        <w:ind w:left="5760" w:hanging="360"/>
+      </w:pPr>
+      <w:rPr>
+        <w:rFonts w:ascii="Courier New" w:hAnsi="Courier New" w:cs="Courier New" w:hint="default"/>
+      </w:rPr>
+    </w:lvl>
+    <w:lvl w:ilvl="8" w:tplc="04090005" w:tentative="1">
+      <w:start w:val="1"/>
+      <w:numFmt w:val="bullet"/>
+      <w:lvlText w:val=""/>
+      <w:lvlJc w:val="left"/>
+      <w:pPr>
+        <w:ind w:left="6480" w:hanging="360"/>
+      </w:pPr>
+      <w:rPr>
+        <w:rFonts w:ascii="Wingdings" w:hAnsi="Wingdings" w:hint="default"/>
+      </w:rPr>
+    </w:lvl>
+  </w:abstractNum>
+  <w:abstractNum w:abstractNumId="14" w15:restartNumberingAfterBreak="0">
     <w:nsid w:val="717738EB"/>
     <w:multiLevelType w:val="multilevel"/>
     <w:tmpl w:val="05C22A5E"/>
@@ -18324,6 +18806,155 @@
       </w:rPr>
     </w:lvl>
     <w:lvl w:ilvl="8">
+      <w:start w:val="1"/>
+      <w:numFmt w:val="bullet"/>
+      <w:lvlText w:val=""/>
+      <w:lvlJc w:val="left"/>
+      <w:pPr>
+        <w:tabs>
+          <w:tab w:val="num" w:pos="6480"/>
+        </w:tabs>
+        <w:ind w:left="6480" w:hanging="360"/>
+      </w:pPr>
+      <w:rPr>
+        <w:rFonts w:ascii="Wingdings" w:hAnsi="Wingdings" w:hint="default"/>
+        <w:sz w:val="20"/>
+      </w:rPr>
+    </w:lvl>
+  </w:abstractNum>
+  <w:abstractNum w:abstractNumId="15" w15:restartNumberingAfterBreak="0">
+    <w:nsid w:val="771B0F94"/>
+    <w:multiLevelType w:val="multilevel"/>
+    <w:tmpl w:val="A2ECE7D0"/>
+    <w:lvl w:ilvl="0">
+      <w:start w:val="1"/>
+      <w:numFmt w:val="bullet"/>
+      <w:lvlText w:val=""/>
+      <w:lvlJc w:val="left"/>
+      <w:pPr>
+        <w:tabs>
+          <w:tab w:val="num" w:pos="720"/>
+        </w:tabs>
+        <w:ind w:left="720" w:hanging="360"/>
+      </w:pPr>
+      <w:rPr>
+        <w:rFonts w:ascii="Symbol" w:hAnsi="Symbol" w:hint="default"/>
+        <w:sz w:val="20"/>
+      </w:rPr>
+    </w:lvl>
+    <w:lvl w:ilvl="1" w:tentative="1">
+      <w:start w:val="1"/>
+      <w:numFmt w:val="bullet"/>
+      <w:lvlText w:val="o"/>
+      <w:lvlJc w:val="left"/>
+      <w:pPr>
+        <w:tabs>
+          <w:tab w:val="num" w:pos="1440"/>
+        </w:tabs>
+        <w:ind w:left="1440" w:hanging="360"/>
+      </w:pPr>
+      <w:rPr>
+        <w:rFonts w:ascii="Courier New" w:hAnsi="Courier New" w:hint="default"/>
+        <w:sz w:val="20"/>
+      </w:rPr>
+    </w:lvl>
+    <w:lvl w:ilvl="2" w:tentative="1">
+      <w:start w:val="1"/>
+      <w:numFmt w:val="bullet"/>
+      <w:lvlText w:val=""/>
+      <w:lvlJc w:val="left"/>
+      <w:pPr>
+        <w:tabs>
+          <w:tab w:val="num" w:pos="2160"/>
+        </w:tabs>
+        <w:ind w:left="2160" w:hanging="360"/>
+      </w:pPr>
+      <w:rPr>
+        <w:rFonts w:ascii="Wingdings" w:hAnsi="Wingdings" w:hint="default"/>
+        <w:sz w:val="20"/>
+      </w:rPr>
+    </w:lvl>
+    <w:lvl w:ilvl="3" w:tentative="1">
+      <w:start w:val="1"/>
+      <w:numFmt w:val="bullet"/>
+      <w:lvlText w:val=""/>
+      <w:lvlJc w:val="left"/>
+      <w:pPr>
+        <w:tabs>
+          <w:tab w:val="num" w:pos="2880"/>
+        </w:tabs>
+        <w:ind w:left="2880" w:hanging="360"/>
+      </w:pPr>
+      <w:rPr>
+        <w:rFonts w:ascii="Wingdings" w:hAnsi="Wingdings" w:hint="default"/>
+        <w:sz w:val="20"/>
+      </w:rPr>
+    </w:lvl>
+    <w:lvl w:ilvl="4" w:tentative="1">
+      <w:start w:val="1"/>
+      <w:numFmt w:val="bullet"/>
+      <w:lvlText w:val=""/>
+      <w:lvlJc w:val="left"/>
+      <w:pPr>
+        <w:tabs>
+          <w:tab w:val="num" w:pos="3600"/>
+        </w:tabs>
+        <w:ind w:left="3600" w:hanging="360"/>
+      </w:pPr>
+      <w:rPr>
+        <w:rFonts w:ascii="Wingdings" w:hAnsi="Wingdings" w:hint="default"/>
+        <w:sz w:val="20"/>
+      </w:rPr>
+    </w:lvl>
+    <w:lvl w:ilvl="5" w:tentative="1">
+      <w:start w:val="1"/>
+      <w:numFmt w:val="bullet"/>
+      <w:lvlText w:val=""/>
+      <w:lvlJc w:val="left"/>
+      <w:pPr>
+        <w:tabs>
+          <w:tab w:val="num" w:pos="4320"/>
+        </w:tabs>
+        <w:ind w:left="4320" w:hanging="360"/>
+      </w:pPr>
+      <w:rPr>
+        <w:rFonts w:ascii="Wingdings" w:hAnsi="Wingdings" w:hint="default"/>
+        <w:sz w:val="20"/>
+      </w:rPr>
+    </w:lvl>
+    <w:lvl w:ilvl="6" w:tentative="1">
+      <w:start w:val="1"/>
+      <w:numFmt w:val="bullet"/>
+      <w:lvlText w:val=""/>
+      <w:lvlJc w:val="left"/>
+      <w:pPr>
+        <w:tabs>
+          <w:tab w:val="num" w:pos="5040"/>
+        </w:tabs>
+        <w:ind w:left="5040" w:hanging="360"/>
+      </w:pPr>
+      <w:rPr>
+        <w:rFonts w:ascii="Wingdings" w:hAnsi="Wingdings" w:hint="default"/>
+        <w:sz w:val="20"/>
+      </w:rPr>
+    </w:lvl>
+    <w:lvl w:ilvl="7" w:tentative="1">
+      <w:start w:val="1"/>
+      <w:numFmt w:val="bullet"/>
+      <w:lvlText w:val=""/>
+      <w:lvlJc w:val="left"/>
+      <w:pPr>
+        <w:tabs>
+          <w:tab w:val="num" w:pos="5760"/>
+        </w:tabs>
+        <w:ind w:left="5760" w:hanging="360"/>
+      </w:pPr>
+      <w:rPr>
+        <w:rFonts w:ascii="Wingdings" w:hAnsi="Wingdings" w:hint="default"/>
+        <w:sz w:val="20"/>
+      </w:rPr>
+    </w:lvl>
+    <w:lvl w:ilvl="8" w:tentative="1">
       <w:start w:val="1"/>
       <w:numFmt w:val="bullet"/>
       <w:lvlText w:val=""/>
@@ -18368,7 +18999,7 @@
     <w:abstractNumId w:val="0"/>
   </w:num>
   <w:num w:numId="10" w16cid:durableId="1363895034">
-    <w:abstractNumId w:val="13"/>
+    <w:abstractNumId w:val="14"/>
   </w:num>
   <w:num w:numId="11" w16cid:durableId="808134137">
     <w:abstractNumId w:val="12"/>
@@ -18381,6 +19012,12 @@
   </w:num>
   <w:num w:numId="14" w16cid:durableId="650598429">
     <w:abstractNumId w:val="9"/>
+  </w:num>
+  <w:num w:numId="15" w16cid:durableId="2006276654">
+    <w:abstractNumId w:val="13"/>
+  </w:num>
+  <w:num w:numId="16" w16cid:durableId="1691293991">
+    <w:abstractNumId w:val="15"/>
   </w:num>
 </w:numbering>
 </file>
@@ -18988,7 +19625,6 @@
   <w:style w:type="character" w:default="1" w:styleId="DefaultParagraphFont">
     <w:name w:val="Default Paragraph Font"/>
     <w:uiPriority w:val="1"/>
-    <w:semiHidden/>
     <w:unhideWhenUsed/>
   </w:style>
   <w:style w:type="table" w:default="1" w:styleId="TableNormal">

</xml_diff>

<commit_message>
added ip addressing table in appendices
</commit_message>
<xml_diff>
--- a/Full_Home_Network_Project.docx
+++ b/Full_Home_Network_Project.docx
@@ -3153,8 +3153,8 @@
                 <w:color w:val="FFFFFF" w:themeColor="background1"/>
               </w:rPr>
             </w:pPr>
-            <w:bookmarkStart w:id="0" w:name="ProjectScope" w:colFirst="0" w:colLast="0"/>
-            <w:bookmarkStart w:id="1" w:name="_Toc226327475"/>
+            <w:bookmarkStart w:id="0" w:name="_Toc226327475"/>
+            <w:bookmarkStart w:id="1" w:name="ProjectScope" w:colFirst="0" w:colLast="0"/>
             <w:r>
               <w:rPr>
                 <w:rFonts w:asciiTheme="minorBidi" w:hAnsiTheme="minorBidi" w:cstheme="minorBidi"/>
@@ -3177,7 +3177,7 @@
               </w:rPr>
               <w:t xml:space="preserve"> Project Scope</w:t>
             </w:r>
-            <w:bookmarkEnd w:id="1"/>
+            <w:bookmarkEnd w:id="0"/>
           </w:p>
         </w:tc>
       </w:tr>
@@ -3194,7 +3194,7 @@
         </w:rPr>
       </w:pPr>
       <w:bookmarkStart w:id="2" w:name="_Toc226327476"/>
-      <w:bookmarkEnd w:id="0"/>
+      <w:bookmarkEnd w:id="1"/>
       <w:r>
         <w:rPr>
           <w:rFonts w:ascii="Segoe UI Emoji" w:hAnsi="Segoe UI Emoji" w:cs="Segoe UI Emoji"/>
@@ -3257,29 +3257,7 @@
           <w:szCs w:val="24"/>
           <w:lang w:bidi="ar-BH"/>
         </w:rPr>
-        <w:t xml:space="preserve">But there is also a Network security issue, as many people don’t </w:t>
-      </w:r>
-      <w:proofErr w:type="spellStart"/>
-      <w:r>
-        <w:rPr>
-          <w:rFonts w:asciiTheme="minorBidi" w:hAnsiTheme="minorBidi"/>
-          <w:color w:val="000000" w:themeColor="text1"/>
-          <w:sz w:val="24"/>
-          <w:szCs w:val="24"/>
-          <w:lang w:bidi="ar-BH"/>
-        </w:rPr>
-        <w:t>realise</w:t>
-      </w:r>
-      <w:proofErr w:type="spellEnd"/>
-      <w:r>
-        <w:rPr>
-          <w:rFonts w:asciiTheme="minorBidi" w:hAnsiTheme="minorBidi"/>
-          <w:color w:val="000000" w:themeColor="text1"/>
-          <w:sz w:val="24"/>
-          <w:szCs w:val="24"/>
-          <w:lang w:bidi="ar-BH"/>
-        </w:rPr>
-        <w:t xml:space="preserve"> that the default settings on their router, and their password, can pose a serious threat to themselves and others, allowing unwanted access to your computer and other devices, data breaches and </w:t>
+        <w:t xml:space="preserve">But there is also a Network security issue, as many people don’t realise that the default settings on their router, and their password, can pose a serious threat to themselves and others, allowing unwanted access to your computer and other devices, data breaches and </w:t>
       </w:r>
       <w:proofErr w:type="spellStart"/>
       <w:r>
@@ -3345,7 +3323,29 @@
           <w:szCs w:val="24"/>
           <w:lang w:bidi="ar-BH"/>
         </w:rPr>
-        <w:t xml:space="preserve"> home network, users can achieve superior performance and a positive user experience while keeping valuable data secure.</w:t>
+        <w:t xml:space="preserve"> home network, users can achieve superior performance and </w:t>
+      </w:r>
+      <w:proofErr w:type="gramStart"/>
+      <w:r>
+        <w:rPr>
+          <w:rFonts w:asciiTheme="minorBidi" w:hAnsiTheme="minorBidi"/>
+          <w:color w:val="000000" w:themeColor="text1"/>
+          <w:sz w:val="24"/>
+          <w:szCs w:val="24"/>
+          <w:lang w:bidi="ar-BH"/>
+        </w:rPr>
+        <w:t>a positive</w:t>
+      </w:r>
+      <w:proofErr w:type="gramEnd"/>
+      <w:r>
+        <w:rPr>
+          <w:rFonts w:asciiTheme="minorBidi" w:hAnsiTheme="minorBidi"/>
+          <w:color w:val="000000" w:themeColor="text1"/>
+          <w:sz w:val="24"/>
+          <w:szCs w:val="24"/>
+          <w:lang w:bidi="ar-BH"/>
+        </w:rPr>
+        <w:t xml:space="preserve"> user experience while keeping valuable data secure.</w:t>
       </w:r>
     </w:p>
     <w:p>
@@ -17788,6 +17788,984 @@
         </w:rPr>
       </w:pPr>
     </w:p>
+    <w:tbl>
+      <w:tblPr>
+        <w:tblStyle w:val="GridTable4-Accent3"/>
+        <w:tblW w:w="9378" w:type="dxa"/>
+        <w:tblLook w:val="04A0" w:firstRow="1" w:lastRow="0" w:firstColumn="1" w:lastColumn="0" w:noHBand="0" w:noVBand="1"/>
+      </w:tblPr>
+      <w:tblGrid>
+        <w:gridCol w:w="1621"/>
+        <w:gridCol w:w="1134"/>
+        <w:gridCol w:w="1326"/>
+        <w:gridCol w:w="1607"/>
+        <w:gridCol w:w="1890"/>
+        <w:gridCol w:w="1800"/>
+      </w:tblGrid>
+      <w:tr>
+        <w:trPr>
+          <w:cnfStyle w:val="100000000000" w:firstRow="1" w:lastRow="0" w:firstColumn="0" w:lastColumn="0" w:oddVBand="0" w:evenVBand="0" w:oddHBand="0" w:evenHBand="0" w:firstRowFirstColumn="0" w:firstRowLastColumn="0" w:lastRowFirstColumn="0" w:lastRowLastColumn="0"/>
+          <w:trHeight w:val="260"/>
+        </w:trPr>
+        <w:tc>
+          <w:tcPr>
+            <w:cnfStyle w:val="001000000000" w:firstRow="0" w:lastRow="0" w:firstColumn="1" w:lastColumn="0" w:oddVBand="0" w:evenVBand="0" w:oddHBand="0" w:evenHBand="0" w:firstRowFirstColumn="0" w:firstRowLastColumn="0" w:lastRowFirstColumn="0" w:lastRowLastColumn="0"/>
+            <w:tcW w:w="0" w:type="auto"/>
+            <w:hideMark/>
+          </w:tcPr>
+          <w:p>
+            <w:pPr>
+              <w:spacing w:line="276" w:lineRule="auto"/>
+            </w:pPr>
+            <w:r>
+              <w:t>Device Name</w:t>
+            </w:r>
+          </w:p>
+        </w:tc>
+        <w:tc>
+          <w:tcPr>
+            <w:tcW w:w="1134" w:type="dxa"/>
+            <w:hideMark/>
+          </w:tcPr>
+          <w:p>
+            <w:pPr>
+              <w:spacing w:line="276" w:lineRule="auto"/>
+              <w:cnfStyle w:val="100000000000" w:firstRow="1" w:lastRow="0" w:firstColumn="0" w:lastColumn="0" w:oddVBand="0" w:evenVBand="0" w:oddHBand="0" w:evenHBand="0" w:firstRowFirstColumn="0" w:firstRowLastColumn="0" w:lastRowFirstColumn="0" w:lastRowLastColumn="0"/>
+            </w:pPr>
+            <w:r>
+              <w:t>Interface</w:t>
+            </w:r>
+          </w:p>
+        </w:tc>
+        <w:tc>
+          <w:tcPr>
+            <w:tcW w:w="1326" w:type="dxa"/>
+            <w:hideMark/>
+          </w:tcPr>
+          <w:p>
+            <w:pPr>
+              <w:spacing w:line="276" w:lineRule="auto"/>
+              <w:cnfStyle w:val="100000000000" w:firstRow="1" w:lastRow="0" w:firstColumn="0" w:lastColumn="0" w:oddVBand="0" w:evenVBand="0" w:oddHBand="0" w:evenHBand="0" w:firstRowFirstColumn="0" w:firstRowLastColumn="0" w:lastRowFirstColumn="0" w:lastRowLastColumn="0"/>
+            </w:pPr>
+            <w:r>
+              <w:t>IP Address</w:t>
+            </w:r>
+          </w:p>
+        </w:tc>
+        <w:tc>
+          <w:tcPr>
+            <w:tcW w:w="1607" w:type="dxa"/>
+            <w:hideMark/>
+          </w:tcPr>
+          <w:p>
+            <w:pPr>
+              <w:spacing w:line="276" w:lineRule="auto"/>
+              <w:cnfStyle w:val="100000000000" w:firstRow="1" w:lastRow="0" w:firstColumn="0" w:lastColumn="0" w:oddVBand="0" w:evenVBand="0" w:oddHBand="0" w:evenHBand="0" w:firstRowFirstColumn="0" w:firstRowLastColumn="0" w:lastRowFirstColumn="0" w:lastRowLastColumn="0"/>
+            </w:pPr>
+            <w:r>
+              <w:t>Subnet Mask</w:t>
+            </w:r>
+          </w:p>
+        </w:tc>
+        <w:tc>
+          <w:tcPr>
+            <w:tcW w:w="1890" w:type="dxa"/>
+            <w:hideMark/>
+          </w:tcPr>
+          <w:p>
+            <w:pPr>
+              <w:spacing w:line="276" w:lineRule="auto"/>
+              <w:cnfStyle w:val="100000000000" w:firstRow="1" w:lastRow="0" w:firstColumn="0" w:lastColumn="0" w:oddVBand="0" w:evenVBand="0" w:oddHBand="0" w:evenHBand="0" w:firstRowFirstColumn="0" w:firstRowLastColumn="0" w:lastRowFirstColumn="0" w:lastRowLastColumn="0"/>
+            </w:pPr>
+            <w:r>
+              <w:t>Default Gateway</w:t>
+            </w:r>
+          </w:p>
+        </w:tc>
+        <w:tc>
+          <w:tcPr>
+            <w:tcW w:w="1800" w:type="dxa"/>
+            <w:hideMark/>
+          </w:tcPr>
+          <w:p>
+            <w:pPr>
+              <w:spacing w:line="276" w:lineRule="auto"/>
+              <w:cnfStyle w:val="100000000000" w:firstRow="1" w:lastRow="0" w:firstColumn="0" w:lastColumn="0" w:oddVBand="0" w:evenVBand="0" w:oddHBand="0" w:evenHBand="0" w:firstRowFirstColumn="0" w:firstRowLastColumn="0" w:lastRowFirstColumn="0" w:lastRowLastColumn="0"/>
+            </w:pPr>
+            <w:r>
+              <w:t>Role / Purpose</w:t>
+            </w:r>
+          </w:p>
+        </w:tc>
+      </w:tr>
+      <w:tr>
+        <w:trPr>
+          <w:cnfStyle w:val="000000100000" w:firstRow="0" w:lastRow="0" w:firstColumn="0" w:lastColumn="0" w:oddVBand="0" w:evenVBand="0" w:oddHBand="1" w:evenHBand="0" w:firstRowFirstColumn="0" w:firstRowLastColumn="0" w:lastRowFirstColumn="0" w:lastRowLastColumn="0"/>
+          <w:trHeight w:val="304"/>
+        </w:trPr>
+        <w:tc>
+          <w:tcPr>
+            <w:cnfStyle w:val="001000000000" w:firstRow="0" w:lastRow="0" w:firstColumn="1" w:lastColumn="0" w:oddVBand="0" w:evenVBand="0" w:oddHBand="0" w:evenHBand="0" w:firstRowFirstColumn="0" w:firstRowLastColumn="0" w:lastRowFirstColumn="0" w:lastRowLastColumn="0"/>
+            <w:tcW w:w="0" w:type="auto"/>
+            <w:hideMark/>
+          </w:tcPr>
+          <w:p>
+            <w:pPr>
+              <w:spacing w:line="276" w:lineRule="auto"/>
+            </w:pPr>
+            <w:r>
+              <w:t>Home-Router</w:t>
+            </w:r>
+          </w:p>
+        </w:tc>
+        <w:tc>
+          <w:tcPr>
+            <w:tcW w:w="1134" w:type="dxa"/>
+            <w:hideMark/>
+          </w:tcPr>
+          <w:p>
+            <w:pPr>
+              <w:spacing w:line="276" w:lineRule="auto"/>
+              <w:cnfStyle w:val="000000100000" w:firstRow="0" w:lastRow="0" w:firstColumn="0" w:lastColumn="0" w:oddVBand="0" w:evenVBand="0" w:oddHBand="1" w:evenHBand="0" w:firstRowFirstColumn="0" w:firstRowLastColumn="0" w:lastRowFirstColumn="0" w:lastRowLastColumn="0"/>
+            </w:pPr>
+            <w:r>
+              <w:t>Gig0/1</w:t>
+            </w:r>
+          </w:p>
+        </w:tc>
+        <w:tc>
+          <w:tcPr>
+            <w:tcW w:w="1326" w:type="dxa"/>
+            <w:hideMark/>
+          </w:tcPr>
+          <w:p>
+            <w:pPr>
+              <w:spacing w:line="276" w:lineRule="auto"/>
+              <w:cnfStyle w:val="000000100000" w:firstRow="0" w:lastRow="0" w:firstColumn="0" w:lastColumn="0" w:oddVBand="0" w:evenVBand="0" w:oddHBand="1" w:evenHBand="0" w:firstRowFirstColumn="0" w:firstRowLastColumn="0" w:lastRowFirstColumn="0" w:lastRowLastColumn="0"/>
+            </w:pPr>
+            <w:r>
+              <w:t>192.168.1.1</w:t>
+            </w:r>
+          </w:p>
+        </w:tc>
+        <w:tc>
+          <w:tcPr>
+            <w:tcW w:w="1607" w:type="dxa"/>
+            <w:hideMark/>
+          </w:tcPr>
+          <w:p>
+            <w:pPr>
+              <w:spacing w:line="276" w:lineRule="auto"/>
+              <w:cnfStyle w:val="000000100000" w:firstRow="0" w:lastRow="0" w:firstColumn="0" w:lastColumn="0" w:oddVBand="0" w:evenVBand="0" w:oddHBand="1" w:evenHBand="0" w:firstRowFirstColumn="0" w:firstRowLastColumn="0" w:lastRowFirstColumn="0" w:lastRowLastColumn="0"/>
+            </w:pPr>
+            <w:r>
+              <w:t>255.255.255.0</w:t>
+            </w:r>
+          </w:p>
+        </w:tc>
+        <w:tc>
+          <w:tcPr>
+            <w:tcW w:w="1890" w:type="dxa"/>
+            <w:hideMark/>
+          </w:tcPr>
+          <w:p>
+            <w:pPr>
+              <w:spacing w:line="276" w:lineRule="auto"/>
+              <w:cnfStyle w:val="000000100000" w:firstRow="0" w:lastRow="0" w:firstColumn="0" w:lastColumn="0" w:oddVBand="0" w:evenVBand="0" w:oddHBand="1" w:evenHBand="0" w:firstRowFirstColumn="0" w:firstRowLastColumn="0" w:lastRowFirstColumn="0" w:lastRowLastColumn="0"/>
+            </w:pPr>
+            <w:r>
+              <w:t>N/A</w:t>
+            </w:r>
+          </w:p>
+        </w:tc>
+        <w:tc>
+          <w:tcPr>
+            <w:tcW w:w="1800" w:type="dxa"/>
+            <w:hideMark/>
+          </w:tcPr>
+          <w:p>
+            <w:pPr>
+              <w:spacing w:line="276" w:lineRule="auto"/>
+              <w:cnfStyle w:val="000000100000" w:firstRow="0" w:lastRow="0" w:firstColumn="0" w:lastColumn="0" w:oddVBand="0" w:evenVBand="0" w:oddHBand="1" w:evenHBand="0" w:firstRowFirstColumn="0" w:firstRowLastColumn="0" w:lastRowFirstColumn="0" w:lastRowLastColumn="0"/>
+            </w:pPr>
+            <w:r>
+              <w:t xml:space="preserve">Default Gateway </w:t>
+            </w:r>
+          </w:p>
+        </w:tc>
+      </w:tr>
+      <w:tr>
+        <w:trPr>
+          <w:trHeight w:val="294"/>
+        </w:trPr>
+        <w:tc>
+          <w:tcPr>
+            <w:cnfStyle w:val="001000000000" w:firstRow="0" w:lastRow="0" w:firstColumn="1" w:lastColumn="0" w:oddVBand="0" w:evenVBand="0" w:oddHBand="0" w:evenHBand="0" w:firstRowFirstColumn="0" w:firstRowLastColumn="0" w:lastRowFirstColumn="0" w:lastRowLastColumn="0"/>
+            <w:tcW w:w="0" w:type="auto"/>
+            <w:hideMark/>
+          </w:tcPr>
+          <w:p>
+            <w:pPr>
+              <w:spacing w:line="276" w:lineRule="auto"/>
+            </w:pPr>
+            <w:r>
+              <w:t>Server</w:t>
+            </w:r>
+          </w:p>
+        </w:tc>
+        <w:tc>
+          <w:tcPr>
+            <w:tcW w:w="1134" w:type="dxa"/>
+            <w:hideMark/>
+          </w:tcPr>
+          <w:p>
+            <w:pPr>
+              <w:spacing w:line="276" w:lineRule="auto"/>
+              <w:cnfStyle w:val="000000000000" w:firstRow="0" w:lastRow="0" w:firstColumn="0" w:lastColumn="0" w:oddVBand="0" w:evenVBand="0" w:oddHBand="0" w:evenHBand="0" w:firstRowFirstColumn="0" w:firstRowLastColumn="0" w:lastRowFirstColumn="0" w:lastRowLastColumn="0"/>
+            </w:pPr>
+            <w:r>
+              <w:t>Fa0</w:t>
+            </w:r>
+          </w:p>
+        </w:tc>
+        <w:tc>
+          <w:tcPr>
+            <w:tcW w:w="1326" w:type="dxa"/>
+            <w:hideMark/>
+          </w:tcPr>
+          <w:p>
+            <w:pPr>
+              <w:spacing w:line="276" w:lineRule="auto"/>
+              <w:cnfStyle w:val="000000000000" w:firstRow="0" w:lastRow="0" w:firstColumn="0" w:lastColumn="0" w:oddVBand="0" w:evenVBand="0" w:oddHBand="0" w:evenHBand="0" w:firstRowFirstColumn="0" w:firstRowLastColumn="0" w:lastRowFirstColumn="0" w:lastRowLastColumn="0"/>
+            </w:pPr>
+            <w:r>
+              <w:t>192.168.1.5</w:t>
+            </w:r>
+          </w:p>
+        </w:tc>
+        <w:tc>
+          <w:tcPr>
+            <w:tcW w:w="1607" w:type="dxa"/>
+            <w:hideMark/>
+          </w:tcPr>
+          <w:p>
+            <w:pPr>
+              <w:spacing w:line="276" w:lineRule="auto"/>
+              <w:cnfStyle w:val="000000000000" w:firstRow="0" w:lastRow="0" w:firstColumn="0" w:lastColumn="0" w:oddVBand="0" w:evenVBand="0" w:oddHBand="0" w:evenHBand="0" w:firstRowFirstColumn="0" w:firstRowLastColumn="0" w:lastRowFirstColumn="0" w:lastRowLastColumn="0"/>
+            </w:pPr>
+            <w:r>
+              <w:t>255.255.255.0</w:t>
+            </w:r>
+          </w:p>
+        </w:tc>
+        <w:tc>
+          <w:tcPr>
+            <w:tcW w:w="1890" w:type="dxa"/>
+            <w:hideMark/>
+          </w:tcPr>
+          <w:p>
+            <w:pPr>
+              <w:spacing w:line="276" w:lineRule="auto"/>
+              <w:cnfStyle w:val="000000000000" w:firstRow="0" w:lastRow="0" w:firstColumn="0" w:lastColumn="0" w:oddVBand="0" w:evenVBand="0" w:oddHBand="0" w:evenHBand="0" w:firstRowFirstColumn="0" w:firstRowLastColumn="0" w:lastRowFirstColumn="0" w:lastRowLastColumn="0"/>
+            </w:pPr>
+            <w:r>
+              <w:t>192.168.1.1</w:t>
+            </w:r>
+          </w:p>
+        </w:tc>
+        <w:tc>
+          <w:tcPr>
+            <w:tcW w:w="1800" w:type="dxa"/>
+            <w:hideMark/>
+          </w:tcPr>
+          <w:p>
+            <w:pPr>
+              <w:spacing w:line="276" w:lineRule="auto"/>
+              <w:cnfStyle w:val="000000000000" w:firstRow="0" w:lastRow="0" w:firstColumn="0" w:lastColumn="0" w:oddVBand="0" w:evenVBand="0" w:oddHBand="0" w:evenHBand="0" w:firstRowFirstColumn="0" w:firstRowLastColumn="0" w:lastRowFirstColumn="0" w:lastRowLastColumn="0"/>
+            </w:pPr>
+            <w:r>
+              <w:t>Media/Storage</w:t>
+            </w:r>
+          </w:p>
+        </w:tc>
+      </w:tr>
+      <w:tr>
+        <w:trPr>
+          <w:cnfStyle w:val="000000100000" w:firstRow="0" w:lastRow="0" w:firstColumn="0" w:lastColumn="0" w:oddVBand="0" w:evenVBand="0" w:oddHBand="1" w:evenHBand="0" w:firstRowFirstColumn="0" w:firstRowLastColumn="0" w:lastRowFirstColumn="0" w:lastRowLastColumn="0"/>
+          <w:trHeight w:val="294"/>
+        </w:trPr>
+        <w:tc>
+          <w:tcPr>
+            <w:cnfStyle w:val="001000000000" w:firstRow="0" w:lastRow="0" w:firstColumn="1" w:lastColumn="0" w:oddVBand="0" w:evenVBand="0" w:oddHBand="0" w:evenHBand="0" w:firstRowFirstColumn="0" w:firstRowLastColumn="0" w:lastRowFirstColumn="0" w:lastRowLastColumn="0"/>
+            <w:tcW w:w="0" w:type="auto"/>
+            <w:hideMark/>
+          </w:tcPr>
+          <w:p>
+            <w:pPr>
+              <w:spacing w:line="276" w:lineRule="auto"/>
+            </w:pPr>
+            <w:r>
+              <w:t>Printer0</w:t>
+            </w:r>
+          </w:p>
+        </w:tc>
+        <w:tc>
+          <w:tcPr>
+            <w:tcW w:w="1134" w:type="dxa"/>
+            <w:hideMark/>
+          </w:tcPr>
+          <w:p>
+            <w:pPr>
+              <w:spacing w:line="276" w:lineRule="auto"/>
+              <w:cnfStyle w:val="000000100000" w:firstRow="0" w:lastRow="0" w:firstColumn="0" w:lastColumn="0" w:oddVBand="0" w:evenVBand="0" w:oddHBand="1" w:evenHBand="0" w:firstRowFirstColumn="0" w:firstRowLastColumn="0" w:lastRowFirstColumn="0" w:lastRowLastColumn="0"/>
+            </w:pPr>
+            <w:r>
+              <w:t>Fa0</w:t>
+            </w:r>
+          </w:p>
+        </w:tc>
+        <w:tc>
+          <w:tcPr>
+            <w:tcW w:w="1326" w:type="dxa"/>
+            <w:hideMark/>
+          </w:tcPr>
+          <w:p>
+            <w:pPr>
+              <w:spacing w:line="276" w:lineRule="auto"/>
+              <w:cnfStyle w:val="000000100000" w:firstRow="0" w:lastRow="0" w:firstColumn="0" w:lastColumn="0" w:oddVBand="0" w:evenVBand="0" w:oddHBand="1" w:evenHBand="0" w:firstRowFirstColumn="0" w:firstRowLastColumn="0" w:lastRowFirstColumn="0" w:lastRowLastColumn="0"/>
+            </w:pPr>
+            <w:r>
+              <w:t>192.168.1.6</w:t>
+            </w:r>
+          </w:p>
+        </w:tc>
+        <w:tc>
+          <w:tcPr>
+            <w:tcW w:w="1607" w:type="dxa"/>
+            <w:hideMark/>
+          </w:tcPr>
+          <w:p>
+            <w:pPr>
+              <w:spacing w:line="276" w:lineRule="auto"/>
+              <w:cnfStyle w:val="000000100000" w:firstRow="0" w:lastRow="0" w:firstColumn="0" w:lastColumn="0" w:oddVBand="0" w:evenVBand="0" w:oddHBand="1" w:evenHBand="0" w:firstRowFirstColumn="0" w:firstRowLastColumn="0" w:lastRowFirstColumn="0" w:lastRowLastColumn="0"/>
+            </w:pPr>
+            <w:r>
+              <w:t>255.255.255.0</w:t>
+            </w:r>
+          </w:p>
+        </w:tc>
+        <w:tc>
+          <w:tcPr>
+            <w:tcW w:w="1890" w:type="dxa"/>
+            <w:hideMark/>
+          </w:tcPr>
+          <w:p>
+            <w:pPr>
+              <w:spacing w:line="276" w:lineRule="auto"/>
+              <w:cnfStyle w:val="000000100000" w:firstRow="0" w:lastRow="0" w:firstColumn="0" w:lastColumn="0" w:oddVBand="0" w:evenVBand="0" w:oddHBand="1" w:evenHBand="0" w:firstRowFirstColumn="0" w:firstRowLastColumn="0" w:lastRowFirstColumn="0" w:lastRowLastColumn="0"/>
+            </w:pPr>
+            <w:r>
+              <w:t>192.168.1.1</w:t>
+            </w:r>
+          </w:p>
+        </w:tc>
+        <w:tc>
+          <w:tcPr>
+            <w:tcW w:w="1800" w:type="dxa"/>
+            <w:hideMark/>
+          </w:tcPr>
+          <w:p>
+            <w:pPr>
+              <w:spacing w:line="276" w:lineRule="auto"/>
+              <w:cnfStyle w:val="000000100000" w:firstRow="0" w:lastRow="0" w:firstColumn="0" w:lastColumn="0" w:oddVBand="0" w:evenVBand="0" w:oddHBand="1" w:evenHBand="0" w:firstRowFirstColumn="0" w:firstRowLastColumn="0" w:lastRowFirstColumn="0" w:lastRowLastColumn="0"/>
+            </w:pPr>
+            <w:r>
+              <w:t xml:space="preserve">Shared Printing </w:t>
+            </w:r>
+          </w:p>
+        </w:tc>
+      </w:tr>
+      <w:tr>
+        <w:trPr>
+          <w:trHeight w:val="294"/>
+        </w:trPr>
+        <w:tc>
+          <w:tcPr>
+            <w:cnfStyle w:val="001000000000" w:firstRow="0" w:lastRow="0" w:firstColumn="1" w:lastColumn="0" w:oddVBand="0" w:evenVBand="0" w:oddHBand="0" w:evenHBand="0" w:firstRowFirstColumn="0" w:firstRowLastColumn="0" w:lastRowFirstColumn="0" w:lastRowLastColumn="0"/>
+            <w:tcW w:w="0" w:type="auto"/>
+            <w:hideMark/>
+          </w:tcPr>
+          <w:p>
+            <w:pPr>
+              <w:spacing w:line="276" w:lineRule="auto"/>
+            </w:pPr>
+            <w:r>
+              <w:t>PC-A</w:t>
+            </w:r>
+          </w:p>
+        </w:tc>
+        <w:tc>
+          <w:tcPr>
+            <w:tcW w:w="1134" w:type="dxa"/>
+            <w:hideMark/>
+          </w:tcPr>
+          <w:p>
+            <w:pPr>
+              <w:spacing w:line="276" w:lineRule="auto"/>
+              <w:cnfStyle w:val="000000000000" w:firstRow="0" w:lastRow="0" w:firstColumn="0" w:lastColumn="0" w:oddVBand="0" w:evenVBand="0" w:oddHBand="0" w:evenHBand="0" w:firstRowFirstColumn="0" w:firstRowLastColumn="0" w:lastRowFirstColumn="0" w:lastRowLastColumn="0"/>
+            </w:pPr>
+            <w:r>
+              <w:t>Fa0</w:t>
+            </w:r>
+          </w:p>
+        </w:tc>
+        <w:tc>
+          <w:tcPr>
+            <w:tcW w:w="1326" w:type="dxa"/>
+            <w:hideMark/>
+          </w:tcPr>
+          <w:p>
+            <w:pPr>
+              <w:spacing w:line="276" w:lineRule="auto"/>
+              <w:jc w:val="center"/>
+              <w:cnfStyle w:val="000000000000" w:firstRow="0" w:lastRow="0" w:firstColumn="0" w:lastColumn="0" w:oddVBand="0" w:evenVBand="0" w:oddHBand="0" w:evenHBand="0" w:firstRowFirstColumn="0" w:firstRowLastColumn="0" w:lastRowFirstColumn="0" w:lastRowLastColumn="0"/>
+            </w:pPr>
+            <w:r>
+              <w:t>DHCP</w:t>
+            </w:r>
+          </w:p>
+        </w:tc>
+        <w:tc>
+          <w:tcPr>
+            <w:tcW w:w="1607" w:type="dxa"/>
+            <w:hideMark/>
+          </w:tcPr>
+          <w:p>
+            <w:pPr>
+              <w:spacing w:line="276" w:lineRule="auto"/>
+              <w:cnfStyle w:val="000000000000" w:firstRow="0" w:lastRow="0" w:firstColumn="0" w:lastColumn="0" w:oddVBand="0" w:evenVBand="0" w:oddHBand="0" w:evenHBand="0" w:firstRowFirstColumn="0" w:firstRowLastColumn="0" w:lastRowFirstColumn="0" w:lastRowLastColumn="0"/>
+            </w:pPr>
+            <w:r>
+              <w:t>255.255.255.0</w:t>
+            </w:r>
+          </w:p>
+        </w:tc>
+        <w:tc>
+          <w:tcPr>
+            <w:tcW w:w="1890" w:type="dxa"/>
+            <w:hideMark/>
+          </w:tcPr>
+          <w:p>
+            <w:pPr>
+              <w:spacing w:line="276" w:lineRule="auto"/>
+              <w:cnfStyle w:val="000000000000" w:firstRow="0" w:lastRow="0" w:firstColumn="0" w:lastColumn="0" w:oddVBand="0" w:evenVBand="0" w:oddHBand="0" w:evenHBand="0" w:firstRowFirstColumn="0" w:firstRowLastColumn="0" w:lastRowFirstColumn="0" w:lastRowLastColumn="0"/>
+            </w:pPr>
+            <w:r>
+              <w:t>192.168.1.1</w:t>
+            </w:r>
+          </w:p>
+        </w:tc>
+        <w:tc>
+          <w:tcPr>
+            <w:tcW w:w="1800" w:type="dxa"/>
+            <w:hideMark/>
+          </w:tcPr>
+          <w:p>
+            <w:pPr>
+              <w:spacing w:line="276" w:lineRule="auto"/>
+              <w:cnfStyle w:val="000000000000" w:firstRow="0" w:lastRow="0" w:firstColumn="0" w:lastColumn="0" w:oddVBand="0" w:evenVBand="0" w:oddHBand="0" w:evenHBand="0" w:firstRowFirstColumn="0" w:firstRowLastColumn="0" w:lastRowFirstColumn="0" w:lastRowLastColumn="0"/>
+            </w:pPr>
+            <w:r>
+              <w:t xml:space="preserve">Office Computer </w:t>
+            </w:r>
+          </w:p>
+        </w:tc>
+      </w:tr>
+      <w:tr>
+        <w:trPr>
+          <w:cnfStyle w:val="000000100000" w:firstRow="0" w:lastRow="0" w:firstColumn="0" w:lastColumn="0" w:oddVBand="0" w:evenVBand="0" w:oddHBand="1" w:evenHBand="0" w:firstRowFirstColumn="0" w:firstRowLastColumn="0" w:lastRowFirstColumn="0" w:lastRowLastColumn="0"/>
+          <w:trHeight w:val="304"/>
+        </w:trPr>
+        <w:tc>
+          <w:tcPr>
+            <w:cnfStyle w:val="001000000000" w:firstRow="0" w:lastRow="0" w:firstColumn="1" w:lastColumn="0" w:oddVBand="0" w:evenVBand="0" w:oddHBand="0" w:evenHBand="0" w:firstRowFirstColumn="0" w:firstRowLastColumn="0" w:lastRowFirstColumn="0" w:lastRowLastColumn="0"/>
+            <w:tcW w:w="0" w:type="auto"/>
+            <w:hideMark/>
+          </w:tcPr>
+          <w:p>
+            <w:pPr>
+              <w:spacing w:line="276" w:lineRule="auto"/>
+            </w:pPr>
+            <w:r>
+              <w:t>PC-B</w:t>
+            </w:r>
+          </w:p>
+        </w:tc>
+        <w:tc>
+          <w:tcPr>
+            <w:tcW w:w="1134" w:type="dxa"/>
+            <w:hideMark/>
+          </w:tcPr>
+          <w:p>
+            <w:pPr>
+              <w:spacing w:line="276" w:lineRule="auto"/>
+              <w:cnfStyle w:val="000000100000" w:firstRow="0" w:lastRow="0" w:firstColumn="0" w:lastColumn="0" w:oddVBand="0" w:evenVBand="0" w:oddHBand="1" w:evenHBand="0" w:firstRowFirstColumn="0" w:firstRowLastColumn="0" w:lastRowFirstColumn="0" w:lastRowLastColumn="0"/>
+            </w:pPr>
+            <w:r>
+              <w:t>Fa0</w:t>
+            </w:r>
+          </w:p>
+        </w:tc>
+        <w:tc>
+          <w:tcPr>
+            <w:tcW w:w="1326" w:type="dxa"/>
+            <w:hideMark/>
+          </w:tcPr>
+          <w:p>
+            <w:pPr>
+              <w:spacing w:line="276" w:lineRule="auto"/>
+              <w:jc w:val="center"/>
+              <w:cnfStyle w:val="000000100000" w:firstRow="0" w:lastRow="0" w:firstColumn="0" w:lastColumn="0" w:oddVBand="0" w:evenVBand="0" w:oddHBand="1" w:evenHBand="0" w:firstRowFirstColumn="0" w:firstRowLastColumn="0" w:lastRowFirstColumn="0" w:lastRowLastColumn="0"/>
+            </w:pPr>
+            <w:r>
+              <w:t>DHCP</w:t>
+            </w:r>
+          </w:p>
+        </w:tc>
+        <w:tc>
+          <w:tcPr>
+            <w:tcW w:w="1607" w:type="dxa"/>
+            <w:hideMark/>
+          </w:tcPr>
+          <w:p>
+            <w:pPr>
+              <w:spacing w:line="276" w:lineRule="auto"/>
+              <w:cnfStyle w:val="000000100000" w:firstRow="0" w:lastRow="0" w:firstColumn="0" w:lastColumn="0" w:oddVBand="0" w:evenVBand="0" w:oddHBand="1" w:evenHBand="0" w:firstRowFirstColumn="0" w:firstRowLastColumn="0" w:lastRowFirstColumn="0" w:lastRowLastColumn="0"/>
+            </w:pPr>
+            <w:r>
+              <w:t>255.255.255.0</w:t>
+            </w:r>
+          </w:p>
+        </w:tc>
+        <w:tc>
+          <w:tcPr>
+            <w:tcW w:w="1890" w:type="dxa"/>
+            <w:hideMark/>
+          </w:tcPr>
+          <w:p>
+            <w:pPr>
+              <w:spacing w:line="276" w:lineRule="auto"/>
+              <w:cnfStyle w:val="000000100000" w:firstRow="0" w:lastRow="0" w:firstColumn="0" w:lastColumn="0" w:oddVBand="0" w:evenVBand="0" w:oddHBand="1" w:evenHBand="0" w:firstRowFirstColumn="0" w:firstRowLastColumn="0" w:lastRowFirstColumn="0" w:lastRowLastColumn="0"/>
+            </w:pPr>
+            <w:r>
+              <w:t>192.168.1.1</w:t>
+            </w:r>
+          </w:p>
+        </w:tc>
+        <w:tc>
+          <w:tcPr>
+            <w:tcW w:w="1800" w:type="dxa"/>
+            <w:hideMark/>
+          </w:tcPr>
+          <w:p>
+            <w:pPr>
+              <w:spacing w:line="276" w:lineRule="auto"/>
+              <w:cnfStyle w:val="000000100000" w:firstRow="0" w:lastRow="0" w:firstColumn="0" w:lastColumn="0" w:oddVBand="0" w:evenVBand="0" w:oddHBand="1" w:evenHBand="0" w:firstRowFirstColumn="0" w:firstRowLastColumn="0" w:lastRowFirstColumn="0" w:lastRowLastColumn="0"/>
+            </w:pPr>
+            <w:r>
+              <w:t xml:space="preserve">Office Computer </w:t>
+            </w:r>
+          </w:p>
+        </w:tc>
+      </w:tr>
+      <w:tr>
+        <w:trPr>
+          <w:trHeight w:val="294"/>
+        </w:trPr>
+        <w:tc>
+          <w:tcPr>
+            <w:cnfStyle w:val="001000000000" w:firstRow="0" w:lastRow="0" w:firstColumn="1" w:lastColumn="0" w:oddVBand="0" w:evenVBand="0" w:oddHBand="0" w:evenHBand="0" w:firstRowFirstColumn="0" w:firstRowLastColumn="0" w:lastRowFirstColumn="0" w:lastRowLastColumn="0"/>
+            <w:tcW w:w="0" w:type="auto"/>
+            <w:hideMark/>
+          </w:tcPr>
+          <w:p>
+            <w:pPr>
+              <w:spacing w:line="276" w:lineRule="auto"/>
+            </w:pPr>
+            <w:r>
+              <w:t>Smart-TV</w:t>
+            </w:r>
+          </w:p>
+        </w:tc>
+        <w:tc>
+          <w:tcPr>
+            <w:tcW w:w="1134" w:type="dxa"/>
+            <w:hideMark/>
+          </w:tcPr>
+          <w:p>
+            <w:pPr>
+              <w:spacing w:line="276" w:lineRule="auto"/>
+              <w:cnfStyle w:val="000000000000" w:firstRow="0" w:lastRow="0" w:firstColumn="0" w:lastColumn="0" w:oddVBand="0" w:evenVBand="0" w:oddHBand="0" w:evenHBand="0" w:firstRowFirstColumn="0" w:firstRowLastColumn="0" w:lastRowFirstColumn="0" w:lastRowLastColumn="0"/>
+            </w:pPr>
+            <w:r>
+              <w:t>Fa0</w:t>
+            </w:r>
+          </w:p>
+        </w:tc>
+        <w:tc>
+          <w:tcPr>
+            <w:tcW w:w="1326" w:type="dxa"/>
+            <w:hideMark/>
+          </w:tcPr>
+          <w:p>
+            <w:pPr>
+              <w:spacing w:line="276" w:lineRule="auto"/>
+              <w:jc w:val="center"/>
+              <w:cnfStyle w:val="000000000000" w:firstRow="0" w:lastRow="0" w:firstColumn="0" w:lastColumn="0" w:oddVBand="0" w:evenVBand="0" w:oddHBand="0" w:evenHBand="0" w:firstRowFirstColumn="0" w:firstRowLastColumn="0" w:lastRowFirstColumn="0" w:lastRowLastColumn="0"/>
+            </w:pPr>
+            <w:r>
+              <w:t>DHCP</w:t>
+            </w:r>
+          </w:p>
+        </w:tc>
+        <w:tc>
+          <w:tcPr>
+            <w:tcW w:w="1607" w:type="dxa"/>
+            <w:hideMark/>
+          </w:tcPr>
+          <w:p>
+            <w:pPr>
+              <w:spacing w:line="276" w:lineRule="auto"/>
+              <w:cnfStyle w:val="000000000000" w:firstRow="0" w:lastRow="0" w:firstColumn="0" w:lastColumn="0" w:oddVBand="0" w:evenVBand="0" w:oddHBand="0" w:evenHBand="0" w:firstRowFirstColumn="0" w:firstRowLastColumn="0" w:lastRowFirstColumn="0" w:lastRowLastColumn="0"/>
+            </w:pPr>
+            <w:r>
+              <w:t>255.255.255.0</w:t>
+            </w:r>
+          </w:p>
+        </w:tc>
+        <w:tc>
+          <w:tcPr>
+            <w:tcW w:w="1890" w:type="dxa"/>
+            <w:hideMark/>
+          </w:tcPr>
+          <w:p>
+            <w:pPr>
+              <w:spacing w:line="276" w:lineRule="auto"/>
+              <w:cnfStyle w:val="000000000000" w:firstRow="0" w:lastRow="0" w:firstColumn="0" w:lastColumn="0" w:oddVBand="0" w:evenVBand="0" w:oddHBand="0" w:evenHBand="0" w:firstRowFirstColumn="0" w:firstRowLastColumn="0" w:lastRowFirstColumn="0" w:lastRowLastColumn="0"/>
+            </w:pPr>
+            <w:r>
+              <w:t>192.168.1.1</w:t>
+            </w:r>
+          </w:p>
+        </w:tc>
+        <w:tc>
+          <w:tcPr>
+            <w:tcW w:w="1800" w:type="dxa"/>
+            <w:hideMark/>
+          </w:tcPr>
+          <w:p>
+            <w:pPr>
+              <w:spacing w:line="276" w:lineRule="auto"/>
+              <w:cnfStyle w:val="000000000000" w:firstRow="0" w:lastRow="0" w:firstColumn="0" w:lastColumn="0" w:oddVBand="0" w:evenVBand="0" w:oddHBand="0" w:evenHBand="0" w:firstRowFirstColumn="0" w:firstRowLastColumn="0" w:lastRowFirstColumn="0" w:lastRowLastColumn="0"/>
+            </w:pPr>
+            <w:r>
+              <w:t xml:space="preserve">Entertainment </w:t>
+            </w:r>
+          </w:p>
+        </w:tc>
+      </w:tr>
+      <w:tr>
+        <w:trPr>
+          <w:cnfStyle w:val="000000100000" w:firstRow="0" w:lastRow="0" w:firstColumn="0" w:lastColumn="0" w:oddVBand="0" w:evenVBand="0" w:oddHBand="1" w:evenHBand="0" w:firstRowFirstColumn="0" w:firstRowLastColumn="0" w:lastRowFirstColumn="0" w:lastRowLastColumn="0"/>
+          <w:trHeight w:val="294"/>
+        </w:trPr>
+        <w:tc>
+          <w:tcPr>
+            <w:cnfStyle w:val="001000000000" w:firstRow="0" w:lastRow="0" w:firstColumn="1" w:lastColumn="0" w:oddVBand="0" w:evenVBand="0" w:oddHBand="0" w:evenHBand="0" w:firstRowFirstColumn="0" w:firstRowLastColumn="0" w:lastRowFirstColumn="0" w:lastRowLastColumn="0"/>
+            <w:tcW w:w="0" w:type="auto"/>
+            <w:hideMark/>
+          </w:tcPr>
+          <w:p>
+            <w:pPr>
+              <w:spacing w:line="276" w:lineRule="auto"/>
+            </w:pPr>
+            <w:r>
+              <w:t>Laptop0</w:t>
+            </w:r>
+          </w:p>
+        </w:tc>
+        <w:tc>
+          <w:tcPr>
+            <w:tcW w:w="1134" w:type="dxa"/>
+            <w:hideMark/>
+          </w:tcPr>
+          <w:p>
+            <w:pPr>
+              <w:spacing w:line="276" w:lineRule="auto"/>
+              <w:cnfStyle w:val="000000100000" w:firstRow="0" w:lastRow="0" w:firstColumn="0" w:lastColumn="0" w:oddVBand="0" w:evenVBand="0" w:oddHBand="1" w:evenHBand="0" w:firstRowFirstColumn="0" w:firstRowLastColumn="0" w:lastRowFirstColumn="0" w:lastRowLastColumn="0"/>
+            </w:pPr>
+            <w:r>
+              <w:t>Wireless</w:t>
+            </w:r>
+          </w:p>
+        </w:tc>
+        <w:tc>
+          <w:tcPr>
+            <w:tcW w:w="1326" w:type="dxa"/>
+            <w:hideMark/>
+          </w:tcPr>
+          <w:p>
+            <w:pPr>
+              <w:spacing w:line="276" w:lineRule="auto"/>
+              <w:jc w:val="center"/>
+              <w:cnfStyle w:val="000000100000" w:firstRow="0" w:lastRow="0" w:firstColumn="0" w:lastColumn="0" w:oddVBand="0" w:evenVBand="0" w:oddHBand="1" w:evenHBand="0" w:firstRowFirstColumn="0" w:firstRowLastColumn="0" w:lastRowFirstColumn="0" w:lastRowLastColumn="0"/>
+            </w:pPr>
+            <w:r>
+              <w:t>DHCP</w:t>
+            </w:r>
+          </w:p>
+        </w:tc>
+        <w:tc>
+          <w:tcPr>
+            <w:tcW w:w="1607" w:type="dxa"/>
+            <w:hideMark/>
+          </w:tcPr>
+          <w:p>
+            <w:pPr>
+              <w:spacing w:line="276" w:lineRule="auto"/>
+              <w:cnfStyle w:val="000000100000" w:firstRow="0" w:lastRow="0" w:firstColumn="0" w:lastColumn="0" w:oddVBand="0" w:evenVBand="0" w:oddHBand="1" w:evenHBand="0" w:firstRowFirstColumn="0" w:firstRowLastColumn="0" w:lastRowFirstColumn="0" w:lastRowLastColumn="0"/>
+            </w:pPr>
+            <w:r>
+              <w:t>255.255.255.0</w:t>
+            </w:r>
+          </w:p>
+        </w:tc>
+        <w:tc>
+          <w:tcPr>
+            <w:tcW w:w="1890" w:type="dxa"/>
+            <w:hideMark/>
+          </w:tcPr>
+          <w:p>
+            <w:pPr>
+              <w:spacing w:line="276" w:lineRule="auto"/>
+              <w:cnfStyle w:val="000000100000" w:firstRow="0" w:lastRow="0" w:firstColumn="0" w:lastColumn="0" w:oddVBand="0" w:evenVBand="0" w:oddHBand="1" w:evenHBand="0" w:firstRowFirstColumn="0" w:firstRowLastColumn="0" w:lastRowFirstColumn="0" w:lastRowLastColumn="0"/>
+            </w:pPr>
+            <w:r>
+              <w:t>192.168.1.1</w:t>
+            </w:r>
+          </w:p>
+        </w:tc>
+        <w:tc>
+          <w:tcPr>
+            <w:tcW w:w="1800" w:type="dxa"/>
+            <w:hideMark/>
+          </w:tcPr>
+          <w:p>
+            <w:pPr>
+              <w:spacing w:line="276" w:lineRule="auto"/>
+              <w:cnfStyle w:val="000000100000" w:firstRow="0" w:lastRow="0" w:firstColumn="0" w:lastColumn="0" w:oddVBand="0" w:evenVBand="0" w:oddHBand="1" w:evenHBand="0" w:firstRowFirstColumn="0" w:firstRowLastColumn="0" w:lastRowFirstColumn="0" w:lastRowLastColumn="0"/>
+            </w:pPr>
+            <w:r>
+              <w:t xml:space="preserve">Mobile User </w:t>
+            </w:r>
+          </w:p>
+        </w:tc>
+      </w:tr>
+      <w:tr>
+        <w:trPr>
+          <w:trHeight w:val="294"/>
+        </w:trPr>
+        <w:tc>
+          <w:tcPr>
+            <w:cnfStyle w:val="001000000000" w:firstRow="0" w:lastRow="0" w:firstColumn="1" w:lastColumn="0" w:oddVBand="0" w:evenVBand="0" w:oddHBand="0" w:evenHBand="0" w:firstRowFirstColumn="0" w:firstRowLastColumn="0" w:lastRowFirstColumn="0" w:lastRowLastColumn="0"/>
+            <w:tcW w:w="0" w:type="auto"/>
+            <w:hideMark/>
+          </w:tcPr>
+          <w:p>
+            <w:pPr>
+              <w:spacing w:line="276" w:lineRule="auto"/>
+            </w:pPr>
+            <w:r>
+              <w:t>Smartphone0</w:t>
+            </w:r>
+          </w:p>
+        </w:tc>
+        <w:tc>
+          <w:tcPr>
+            <w:tcW w:w="1134" w:type="dxa"/>
+            <w:hideMark/>
+          </w:tcPr>
+          <w:p>
+            <w:pPr>
+              <w:spacing w:line="276" w:lineRule="auto"/>
+              <w:cnfStyle w:val="000000000000" w:firstRow="0" w:lastRow="0" w:firstColumn="0" w:lastColumn="0" w:oddVBand="0" w:evenVBand="0" w:oddHBand="0" w:evenHBand="0" w:firstRowFirstColumn="0" w:firstRowLastColumn="0" w:lastRowFirstColumn="0" w:lastRowLastColumn="0"/>
+            </w:pPr>
+            <w:r>
+              <w:t>Wireless</w:t>
+            </w:r>
+          </w:p>
+        </w:tc>
+        <w:tc>
+          <w:tcPr>
+            <w:tcW w:w="1326" w:type="dxa"/>
+            <w:hideMark/>
+          </w:tcPr>
+          <w:p>
+            <w:pPr>
+              <w:spacing w:line="276" w:lineRule="auto"/>
+              <w:jc w:val="center"/>
+              <w:cnfStyle w:val="000000000000" w:firstRow="0" w:lastRow="0" w:firstColumn="0" w:lastColumn="0" w:oddVBand="0" w:evenVBand="0" w:oddHBand="0" w:evenHBand="0" w:firstRowFirstColumn="0" w:firstRowLastColumn="0" w:lastRowFirstColumn="0" w:lastRowLastColumn="0"/>
+            </w:pPr>
+            <w:r>
+              <w:t>DHCP</w:t>
+            </w:r>
+          </w:p>
+        </w:tc>
+        <w:tc>
+          <w:tcPr>
+            <w:tcW w:w="1607" w:type="dxa"/>
+            <w:hideMark/>
+          </w:tcPr>
+          <w:p>
+            <w:pPr>
+              <w:spacing w:line="276" w:lineRule="auto"/>
+              <w:cnfStyle w:val="000000000000" w:firstRow="0" w:lastRow="0" w:firstColumn="0" w:lastColumn="0" w:oddVBand="0" w:evenVBand="0" w:oddHBand="0" w:evenHBand="0" w:firstRowFirstColumn="0" w:firstRowLastColumn="0" w:lastRowFirstColumn="0" w:lastRowLastColumn="0"/>
+            </w:pPr>
+            <w:r>
+              <w:t>255.255.255.0</w:t>
+            </w:r>
+          </w:p>
+        </w:tc>
+        <w:tc>
+          <w:tcPr>
+            <w:tcW w:w="1890" w:type="dxa"/>
+            <w:hideMark/>
+          </w:tcPr>
+          <w:p>
+            <w:pPr>
+              <w:spacing w:line="276" w:lineRule="auto"/>
+              <w:cnfStyle w:val="000000000000" w:firstRow="0" w:lastRow="0" w:firstColumn="0" w:lastColumn="0" w:oddVBand="0" w:evenVBand="0" w:oddHBand="0" w:evenHBand="0" w:firstRowFirstColumn="0" w:firstRowLastColumn="0" w:lastRowFirstColumn="0" w:lastRowLastColumn="0"/>
+            </w:pPr>
+            <w:r>
+              <w:t>192.168.1.1</w:t>
+            </w:r>
+          </w:p>
+        </w:tc>
+        <w:tc>
+          <w:tcPr>
+            <w:tcW w:w="1800" w:type="dxa"/>
+            <w:hideMark/>
+          </w:tcPr>
+          <w:p>
+            <w:pPr>
+              <w:spacing w:line="276" w:lineRule="auto"/>
+              <w:cnfStyle w:val="000000000000" w:firstRow="0" w:lastRow="0" w:firstColumn="0" w:lastColumn="0" w:oddVBand="0" w:evenVBand="0" w:oddHBand="0" w:evenHBand="0" w:firstRowFirstColumn="0" w:firstRowLastColumn="0" w:lastRowFirstColumn="0" w:lastRowLastColumn="0"/>
+            </w:pPr>
+            <w:r>
+              <w:t xml:space="preserve">Mobile User </w:t>
+            </w:r>
+          </w:p>
+        </w:tc>
+      </w:tr>
+      <w:tr>
+        <w:trPr>
+          <w:cnfStyle w:val="000000100000" w:firstRow="0" w:lastRow="0" w:firstColumn="0" w:lastColumn="0" w:oddVBand="0" w:evenVBand="0" w:oddHBand="1" w:evenHBand="0" w:firstRowFirstColumn="0" w:firstRowLastColumn="0" w:lastRowFirstColumn="0" w:lastRowLastColumn="0"/>
+          <w:trHeight w:val="304"/>
+        </w:trPr>
+        <w:tc>
+          <w:tcPr>
+            <w:cnfStyle w:val="001000000000" w:firstRow="0" w:lastRow="0" w:firstColumn="1" w:lastColumn="0" w:oddVBand="0" w:evenVBand="0" w:oddHBand="0" w:evenHBand="0" w:firstRowFirstColumn="0" w:firstRowLastColumn="0" w:lastRowFirstColumn="0" w:lastRowLastColumn="0"/>
+            <w:tcW w:w="0" w:type="auto"/>
+            <w:hideMark/>
+          </w:tcPr>
+          <w:p>
+            <w:pPr>
+              <w:spacing w:line="276" w:lineRule="auto"/>
+            </w:pPr>
+            <w:r>
+              <w:t>Tablet0</w:t>
+            </w:r>
+          </w:p>
+        </w:tc>
+        <w:tc>
+          <w:tcPr>
+            <w:tcW w:w="1134" w:type="dxa"/>
+            <w:hideMark/>
+          </w:tcPr>
+          <w:p>
+            <w:pPr>
+              <w:spacing w:line="276" w:lineRule="auto"/>
+              <w:cnfStyle w:val="000000100000" w:firstRow="0" w:lastRow="0" w:firstColumn="0" w:lastColumn="0" w:oddVBand="0" w:evenVBand="0" w:oddHBand="1" w:evenHBand="0" w:firstRowFirstColumn="0" w:firstRowLastColumn="0" w:lastRowFirstColumn="0" w:lastRowLastColumn="0"/>
+            </w:pPr>
+            <w:r>
+              <w:t>Wireless</w:t>
+            </w:r>
+          </w:p>
+        </w:tc>
+        <w:tc>
+          <w:tcPr>
+            <w:tcW w:w="1326" w:type="dxa"/>
+            <w:hideMark/>
+          </w:tcPr>
+          <w:p>
+            <w:pPr>
+              <w:spacing w:line="276" w:lineRule="auto"/>
+              <w:jc w:val="center"/>
+              <w:cnfStyle w:val="000000100000" w:firstRow="0" w:lastRow="0" w:firstColumn="0" w:lastColumn="0" w:oddVBand="0" w:evenVBand="0" w:oddHBand="1" w:evenHBand="0" w:firstRowFirstColumn="0" w:firstRowLastColumn="0" w:lastRowFirstColumn="0" w:lastRowLastColumn="0"/>
+            </w:pPr>
+            <w:r>
+              <w:t>DHCP</w:t>
+            </w:r>
+          </w:p>
+        </w:tc>
+        <w:tc>
+          <w:tcPr>
+            <w:tcW w:w="1607" w:type="dxa"/>
+            <w:hideMark/>
+          </w:tcPr>
+          <w:p>
+            <w:pPr>
+              <w:spacing w:line="276" w:lineRule="auto"/>
+              <w:cnfStyle w:val="000000100000" w:firstRow="0" w:lastRow="0" w:firstColumn="0" w:lastColumn="0" w:oddVBand="0" w:evenVBand="0" w:oddHBand="1" w:evenHBand="0" w:firstRowFirstColumn="0" w:firstRowLastColumn="0" w:lastRowFirstColumn="0" w:lastRowLastColumn="0"/>
+            </w:pPr>
+            <w:r>
+              <w:t>255.255.255.0</w:t>
+            </w:r>
+          </w:p>
+        </w:tc>
+        <w:tc>
+          <w:tcPr>
+            <w:tcW w:w="1890" w:type="dxa"/>
+            <w:hideMark/>
+          </w:tcPr>
+          <w:p>
+            <w:pPr>
+              <w:spacing w:line="276" w:lineRule="auto"/>
+              <w:cnfStyle w:val="000000100000" w:firstRow="0" w:lastRow="0" w:firstColumn="0" w:lastColumn="0" w:oddVBand="0" w:evenVBand="0" w:oddHBand="1" w:evenHBand="0" w:firstRowFirstColumn="0" w:firstRowLastColumn="0" w:lastRowFirstColumn="0" w:lastRowLastColumn="0"/>
+            </w:pPr>
+            <w:r>
+              <w:t>192.168.1.1</w:t>
+            </w:r>
+          </w:p>
+        </w:tc>
+        <w:tc>
+          <w:tcPr>
+            <w:tcW w:w="1800" w:type="dxa"/>
+            <w:hideMark/>
+          </w:tcPr>
+          <w:p>
+            <w:pPr>
+              <w:spacing w:line="276" w:lineRule="auto"/>
+              <w:cnfStyle w:val="000000100000" w:firstRow="0" w:lastRow="0" w:firstColumn="0" w:lastColumn="0" w:oddVBand="0" w:evenVBand="0" w:oddHBand="1" w:evenHBand="0" w:firstRowFirstColumn="0" w:firstRowLastColumn="0" w:lastRowFirstColumn="0" w:lastRowLastColumn="0"/>
+            </w:pPr>
+            <w:r>
+              <w:t>Mobile User</w:t>
+            </w:r>
+          </w:p>
+        </w:tc>
+      </w:tr>
+    </w:tbl>
+    <w:p/>
     <w:sectPr>
       <w:headerReference w:type="default" r:id="rId8"/>
       <w:pgSz w:w="12240" w:h="15840"/>
@@ -30452,6 +31430,82 @@
       <w:szCs w:val="24"/>
     </w:rPr>
   </w:style>
+  <w:style w:type="table" w:styleId="GridTable4-Accent3">
+    <w:name w:val="Grid Table 4 Accent 3"/>
+    <w:basedOn w:val="TableNormal"/>
+    <w:uiPriority w:val="49"/>
+    <w:rsid w:val="001E1F2D"/>
+    <w:pPr>
+      <w:spacing w:after="0" w:line="240" w:lineRule="auto"/>
+    </w:pPr>
+    <w:tblPr>
+      <w:tblStyleRowBandSize w:val="1"/>
+      <w:tblStyleColBandSize w:val="1"/>
+      <w:tblBorders>
+        <w:top w:val="single" w:sz="4" w:space="0" w:color="C2D69B" w:themeColor="accent3" w:themeTint="99"/>
+        <w:left w:val="single" w:sz="4" w:space="0" w:color="C2D69B" w:themeColor="accent3" w:themeTint="99"/>
+        <w:bottom w:val="single" w:sz="4" w:space="0" w:color="C2D69B" w:themeColor="accent3" w:themeTint="99"/>
+        <w:right w:val="single" w:sz="4" w:space="0" w:color="C2D69B" w:themeColor="accent3" w:themeTint="99"/>
+        <w:insideH w:val="single" w:sz="4" w:space="0" w:color="C2D69B" w:themeColor="accent3" w:themeTint="99"/>
+        <w:insideV w:val="single" w:sz="4" w:space="0" w:color="C2D69B" w:themeColor="accent3" w:themeTint="99"/>
+      </w:tblBorders>
+    </w:tblPr>
+    <w:tblStylePr w:type="firstRow">
+      <w:rPr>
+        <w:b/>
+        <w:bCs/>
+        <w:color w:val="FFFFFF" w:themeColor="background1"/>
+      </w:rPr>
+      <w:tblPr/>
+      <w:tcPr>
+        <w:tcBorders>
+          <w:top w:val="single" w:sz="4" w:space="0" w:color="9BBB59" w:themeColor="accent3"/>
+          <w:left w:val="single" w:sz="4" w:space="0" w:color="9BBB59" w:themeColor="accent3"/>
+          <w:bottom w:val="single" w:sz="4" w:space="0" w:color="9BBB59" w:themeColor="accent3"/>
+          <w:right w:val="single" w:sz="4" w:space="0" w:color="9BBB59" w:themeColor="accent3"/>
+          <w:insideH w:val="nil"/>
+          <w:insideV w:val="nil"/>
+        </w:tcBorders>
+        <w:shd w:val="clear" w:color="auto" w:fill="9BBB59" w:themeFill="accent3"/>
+      </w:tcPr>
+    </w:tblStylePr>
+    <w:tblStylePr w:type="lastRow">
+      <w:rPr>
+        <w:b/>
+        <w:bCs/>
+      </w:rPr>
+      <w:tblPr/>
+      <w:tcPr>
+        <w:tcBorders>
+          <w:top w:val="double" w:sz="4" w:space="0" w:color="9BBB59" w:themeColor="accent3"/>
+        </w:tcBorders>
+      </w:tcPr>
+    </w:tblStylePr>
+    <w:tblStylePr w:type="firstCol">
+      <w:rPr>
+        <w:b/>
+        <w:bCs/>
+      </w:rPr>
+    </w:tblStylePr>
+    <w:tblStylePr w:type="lastCol">
+      <w:rPr>
+        <w:b/>
+        <w:bCs/>
+      </w:rPr>
+    </w:tblStylePr>
+    <w:tblStylePr w:type="band1Vert">
+      <w:tblPr/>
+      <w:tcPr>
+        <w:shd w:val="clear" w:color="auto" w:fill="EAF1DD" w:themeFill="accent3" w:themeFillTint="33"/>
+      </w:tcPr>
+    </w:tblStylePr>
+    <w:tblStylePr w:type="band1Horz">
+      <w:tblPr/>
+      <w:tcPr>
+        <w:shd w:val="clear" w:color="auto" w:fill="EAF1DD" w:themeFill="accent3" w:themeFillTint="33"/>
+      </w:tcPr>
+    </w:tblStylePr>
+  </w:style>
 </w:styles>
 </file>
 

</xml_diff>